<commit_message>
lab2 fix + lab5
</commit_message>
<xml_diff>
--- a/lab1(1).docx
+++ b/lab1(1).docx
@@ -795,7 +795,6 @@
                 <w:lang w:val="ru-RU" w:bidi="ar"/>
               </w:rPr>
             </w:pPr>
-            <w:proofErr w:type="spellStart"/>
             <w:r>
               <w:rPr>
                 <w:rFonts w:ascii="Times New Roman" w:eastAsia="Aptos" w:hAnsi="Times New Roman" w:cs="Times New Roman"/>
@@ -806,7 +805,6 @@
               </w:rPr>
               <w:t>user</w:t>
             </w:r>
-            <w:proofErr w:type="spellEnd"/>
           </w:p>
         </w:tc>
         <w:tc>
@@ -824,7 +822,6 @@
                 <w:lang w:bidi="ar"/>
               </w:rPr>
             </w:pPr>
-            <w:proofErr w:type="spellStart"/>
             <w:r>
               <w:rPr>
                 <w:rFonts w:ascii="Times New Roman" w:eastAsia="Aptos" w:hAnsi="Times New Roman" w:cs="Times New Roman"/>
@@ -833,119 +830,8 @@
                 <w:szCs w:val="24"/>
                 <w:lang w:bidi="ar"/>
               </w:rPr>
-              <w:t>user_id</w:t>
+              <w:t>user_id, full_name, position, email, phone, login, password_hash, role_id, department_id, status, created_at</w:t>
             </w:r>
-            <w:proofErr w:type="spellEnd"/>
-            <w:r>
-              <w:rPr>
-                <w:rFonts w:ascii="Times New Roman" w:eastAsia="Aptos" w:hAnsi="Times New Roman" w:cs="Times New Roman"/>
-                <w:kern w:val="2"/>
-                <w:sz w:val="24"/>
-                <w:szCs w:val="24"/>
-                <w:lang w:bidi="ar"/>
-              </w:rPr>
-              <w:t xml:space="preserve">, </w:t>
-            </w:r>
-            <w:proofErr w:type="spellStart"/>
-            <w:r>
-              <w:rPr>
-                <w:rFonts w:ascii="Times New Roman" w:eastAsia="Aptos" w:hAnsi="Times New Roman" w:cs="Times New Roman"/>
-                <w:kern w:val="2"/>
-                <w:sz w:val="24"/>
-                <w:szCs w:val="24"/>
-                <w:lang w:bidi="ar"/>
-              </w:rPr>
-              <w:t>full_name</w:t>
-            </w:r>
-            <w:proofErr w:type="spellEnd"/>
-            <w:r>
-              <w:rPr>
-                <w:rFonts w:ascii="Times New Roman" w:eastAsia="Aptos" w:hAnsi="Times New Roman" w:cs="Times New Roman"/>
-                <w:kern w:val="2"/>
-                <w:sz w:val="24"/>
-                <w:szCs w:val="24"/>
-                <w:lang w:bidi="ar"/>
-              </w:rPr>
-              <w:t xml:space="preserve">, position, email, phone, login, </w:t>
-            </w:r>
-            <w:proofErr w:type="spellStart"/>
-            <w:r>
-              <w:rPr>
-                <w:rFonts w:ascii="Times New Roman" w:eastAsia="Aptos" w:hAnsi="Times New Roman" w:cs="Times New Roman"/>
-                <w:kern w:val="2"/>
-                <w:sz w:val="24"/>
-                <w:szCs w:val="24"/>
-                <w:lang w:bidi="ar"/>
-              </w:rPr>
-              <w:t>password_hash</w:t>
-            </w:r>
-            <w:proofErr w:type="spellEnd"/>
-            <w:r>
-              <w:rPr>
-                <w:rFonts w:ascii="Times New Roman" w:eastAsia="Aptos" w:hAnsi="Times New Roman" w:cs="Times New Roman"/>
-                <w:kern w:val="2"/>
-                <w:sz w:val="24"/>
-                <w:szCs w:val="24"/>
-                <w:lang w:bidi="ar"/>
-              </w:rPr>
-              <w:t xml:space="preserve">, </w:t>
-            </w:r>
-            <w:proofErr w:type="spellStart"/>
-            <w:r>
-              <w:rPr>
-                <w:rFonts w:ascii="Times New Roman" w:eastAsia="Aptos" w:hAnsi="Times New Roman" w:cs="Times New Roman"/>
-                <w:kern w:val="2"/>
-                <w:sz w:val="24"/>
-                <w:szCs w:val="24"/>
-                <w:lang w:bidi="ar"/>
-              </w:rPr>
-              <w:t>role_id</w:t>
-            </w:r>
-            <w:proofErr w:type="spellEnd"/>
-            <w:r>
-              <w:rPr>
-                <w:rFonts w:ascii="Times New Roman" w:eastAsia="Aptos" w:hAnsi="Times New Roman" w:cs="Times New Roman"/>
-                <w:kern w:val="2"/>
-                <w:sz w:val="24"/>
-                <w:szCs w:val="24"/>
-                <w:lang w:bidi="ar"/>
-              </w:rPr>
-              <w:t xml:space="preserve">, </w:t>
-            </w:r>
-            <w:proofErr w:type="spellStart"/>
-            <w:r>
-              <w:rPr>
-                <w:rFonts w:ascii="Times New Roman" w:eastAsia="Aptos" w:hAnsi="Times New Roman" w:cs="Times New Roman"/>
-                <w:kern w:val="2"/>
-                <w:sz w:val="24"/>
-                <w:szCs w:val="24"/>
-                <w:lang w:bidi="ar"/>
-              </w:rPr>
-              <w:t>department_id</w:t>
-            </w:r>
-            <w:proofErr w:type="spellEnd"/>
-            <w:r>
-              <w:rPr>
-                <w:rFonts w:ascii="Times New Roman" w:eastAsia="Aptos" w:hAnsi="Times New Roman" w:cs="Times New Roman"/>
-                <w:kern w:val="2"/>
-                <w:sz w:val="24"/>
-                <w:szCs w:val="24"/>
-                <w:lang w:bidi="ar"/>
-              </w:rPr>
-              <w:t xml:space="preserve">, status, </w:t>
-            </w:r>
-            <w:proofErr w:type="spellStart"/>
-            <w:r>
-              <w:rPr>
-                <w:rFonts w:ascii="Times New Roman" w:eastAsia="Aptos" w:hAnsi="Times New Roman" w:cs="Times New Roman"/>
-                <w:kern w:val="2"/>
-                <w:sz w:val="24"/>
-                <w:szCs w:val="24"/>
-                <w:lang w:bidi="ar"/>
-              </w:rPr>
-              <w:t>created_at</w:t>
-            </w:r>
-            <w:proofErr w:type="spellEnd"/>
           </w:p>
         </w:tc>
       </w:tr>
@@ -992,7 +878,6 @@
                 <w:lang w:val="ru-RU" w:bidi="ar"/>
               </w:rPr>
             </w:pPr>
-            <w:proofErr w:type="spellStart"/>
             <w:r>
               <w:rPr>
                 <w:rFonts w:ascii="Times New Roman" w:eastAsia="Aptos" w:hAnsi="Times New Roman" w:cs="Times New Roman"/>
@@ -1003,7 +888,6 @@
               </w:rPr>
               <w:t>role</w:t>
             </w:r>
-            <w:proofErr w:type="spellEnd"/>
           </w:p>
         </w:tc>
         <w:tc>
@@ -1021,7 +905,6 @@
                 <w:lang w:bidi="ar"/>
               </w:rPr>
             </w:pPr>
-            <w:proofErr w:type="spellStart"/>
             <w:r>
               <w:rPr>
                 <w:rFonts w:ascii="Times New Roman" w:eastAsia="Aptos" w:hAnsi="Times New Roman" w:cs="Times New Roman"/>
@@ -1030,40 +913,7 @@
                 <w:szCs w:val="24"/>
                 <w:lang w:bidi="ar"/>
               </w:rPr>
-              <w:t>role_id</w:t>
-            </w:r>
-            <w:proofErr w:type="spellEnd"/>
-            <w:r>
-              <w:rPr>
-                <w:rFonts w:ascii="Times New Roman" w:eastAsia="Aptos" w:hAnsi="Times New Roman" w:cs="Times New Roman"/>
-                <w:kern w:val="2"/>
-                <w:sz w:val="24"/>
-                <w:szCs w:val="24"/>
-                <w:lang w:bidi="ar"/>
-              </w:rPr>
-              <w:t xml:space="preserve">, </w:t>
-            </w:r>
-            <w:proofErr w:type="spellStart"/>
-            <w:r>
-              <w:rPr>
-                <w:rFonts w:ascii="Times New Roman" w:eastAsia="Aptos" w:hAnsi="Times New Roman" w:cs="Times New Roman"/>
-                <w:kern w:val="2"/>
-                <w:sz w:val="24"/>
-                <w:szCs w:val="24"/>
-                <w:lang w:bidi="ar"/>
-              </w:rPr>
-              <w:t>role_name</w:t>
-            </w:r>
-            <w:proofErr w:type="spellEnd"/>
-            <w:r>
-              <w:rPr>
-                <w:rFonts w:ascii="Times New Roman" w:eastAsia="Aptos" w:hAnsi="Times New Roman" w:cs="Times New Roman"/>
-                <w:kern w:val="2"/>
-                <w:sz w:val="24"/>
-                <w:szCs w:val="24"/>
-                <w:lang w:bidi="ar"/>
-              </w:rPr>
-              <w:t>, description</w:t>
+              <w:t>role_id, role_name, description</w:t>
             </w:r>
           </w:p>
         </w:tc>
@@ -1111,7 +961,6 @@
                 <w:lang w:val="ru-RU" w:bidi="ar"/>
               </w:rPr>
             </w:pPr>
-            <w:proofErr w:type="spellStart"/>
             <w:r>
               <w:rPr>
                 <w:rFonts w:ascii="Times New Roman" w:eastAsia="Aptos" w:hAnsi="Times New Roman" w:cs="Times New Roman"/>
@@ -1122,7 +971,6 @@
               </w:rPr>
               <w:t>department</w:t>
             </w:r>
-            <w:proofErr w:type="spellEnd"/>
           </w:p>
         </w:tc>
         <w:tc>
@@ -1140,7 +988,6 @@
                 <w:lang w:bidi="ar"/>
               </w:rPr>
             </w:pPr>
-            <w:proofErr w:type="spellStart"/>
             <w:r>
               <w:rPr>
                 <w:rFonts w:ascii="Times New Roman" w:eastAsia="Aptos" w:hAnsi="Times New Roman" w:cs="Times New Roman"/>
@@ -1149,434 +996,7 @@
                 <w:szCs w:val="24"/>
                 <w:lang w:bidi="ar"/>
               </w:rPr>
-              <w:t>department_id</w:t>
-            </w:r>
-            <w:proofErr w:type="spellEnd"/>
-            <w:r>
-              <w:rPr>
-                <w:rFonts w:ascii="Times New Roman" w:eastAsia="Aptos" w:hAnsi="Times New Roman" w:cs="Times New Roman"/>
-                <w:kern w:val="2"/>
-                <w:sz w:val="24"/>
-                <w:szCs w:val="24"/>
-                <w:lang w:bidi="ar"/>
-              </w:rPr>
-              <w:t xml:space="preserve">, </w:t>
-            </w:r>
-            <w:proofErr w:type="spellStart"/>
-            <w:r>
-              <w:rPr>
-                <w:rFonts w:ascii="Times New Roman" w:eastAsia="Aptos" w:hAnsi="Times New Roman" w:cs="Times New Roman"/>
-                <w:kern w:val="2"/>
-                <w:sz w:val="24"/>
-                <w:szCs w:val="24"/>
-                <w:lang w:bidi="ar"/>
-              </w:rPr>
-              <w:t>department_name</w:t>
-            </w:r>
-            <w:proofErr w:type="spellEnd"/>
-            <w:r>
-              <w:rPr>
-                <w:rFonts w:ascii="Times New Roman" w:eastAsia="Aptos" w:hAnsi="Times New Roman" w:cs="Times New Roman"/>
-                <w:kern w:val="2"/>
-                <w:sz w:val="24"/>
-                <w:szCs w:val="24"/>
-                <w:lang w:bidi="ar"/>
-              </w:rPr>
-              <w:t xml:space="preserve">, </w:t>
-            </w:r>
-            <w:proofErr w:type="spellStart"/>
-            <w:r>
-              <w:rPr>
-                <w:rFonts w:ascii="Times New Roman" w:eastAsia="Aptos" w:hAnsi="Times New Roman" w:cs="Times New Roman"/>
-                <w:kern w:val="2"/>
-                <w:sz w:val="24"/>
-                <w:szCs w:val="24"/>
-                <w:lang w:bidi="ar"/>
-              </w:rPr>
-              <w:t>parent_department_id</w:t>
-            </w:r>
-            <w:proofErr w:type="spellEnd"/>
-          </w:p>
-        </w:tc>
-      </w:tr>
-      <w:tr>
-        <w:tc>
-          <w:tcPr>
-            <w:tcW w:w="0" w:type="auto"/>
-            <w:hideMark/>
-          </w:tcPr>
-          <w:p>
-            <w:pPr>
-              <w:rPr>
-                <w:rFonts w:ascii="Times New Roman" w:eastAsia="Aptos" w:hAnsi="Times New Roman" w:cs="Times New Roman"/>
-                <w:kern w:val="2"/>
-                <w:sz w:val="24"/>
-                <w:szCs w:val="24"/>
-                <w:lang w:val="ru-RU" w:bidi="ar"/>
-              </w:rPr>
-            </w:pPr>
-            <w:r>
-              <w:rPr>
-                <w:rFonts w:ascii="Times New Roman" w:eastAsia="Aptos" w:hAnsi="Times New Roman" w:cs="Times New Roman"/>
-                <w:kern w:val="2"/>
-                <w:sz w:val="24"/>
-                <w:szCs w:val="24"/>
-                <w:lang w:val="ru-RU" w:bidi="ar"/>
-              </w:rPr>
-              <w:t>Управление поручениями</w:t>
-            </w:r>
-          </w:p>
-        </w:tc>
-        <w:tc>
-          <w:tcPr>
-            <w:tcW w:w="0" w:type="auto"/>
-            <w:hideMark/>
-          </w:tcPr>
-          <w:p>
-            <w:pPr>
-              <w:rPr>
-                <w:rFonts w:ascii="Times New Roman" w:eastAsia="Aptos" w:hAnsi="Times New Roman" w:cs="Times New Roman"/>
-                <w:kern w:val="2"/>
-                <w:sz w:val="24"/>
-                <w:szCs w:val="24"/>
-                <w:lang w:val="ru-RU" w:bidi="ar"/>
-              </w:rPr>
-            </w:pPr>
-            <w:proofErr w:type="spellStart"/>
-            <w:r>
-              <w:rPr>
-                <w:rFonts w:ascii="Times New Roman" w:eastAsia="Aptos" w:hAnsi="Times New Roman" w:cs="Times New Roman"/>
-                <w:kern w:val="2"/>
-                <w:sz w:val="24"/>
-                <w:szCs w:val="24"/>
-                <w:lang w:val="ru-RU" w:bidi="ar"/>
-              </w:rPr>
-              <w:t>task</w:t>
-            </w:r>
-            <w:proofErr w:type="spellEnd"/>
-          </w:p>
-        </w:tc>
-        <w:tc>
-          <w:tcPr>
-            <w:tcW w:w="0" w:type="auto"/>
-            <w:hideMark/>
-          </w:tcPr>
-          <w:p>
-            <w:pPr>
-              <w:rPr>
-                <w:rFonts w:ascii="Times New Roman" w:eastAsia="Aptos" w:hAnsi="Times New Roman" w:cs="Times New Roman"/>
-                <w:kern w:val="2"/>
-                <w:sz w:val="24"/>
-                <w:szCs w:val="24"/>
-                <w:lang w:bidi="ar"/>
-              </w:rPr>
-            </w:pPr>
-            <w:proofErr w:type="spellStart"/>
-            <w:r>
-              <w:rPr>
-                <w:rFonts w:ascii="Times New Roman" w:eastAsia="Aptos" w:hAnsi="Times New Roman" w:cs="Times New Roman"/>
-                <w:kern w:val="2"/>
-                <w:sz w:val="24"/>
-                <w:szCs w:val="24"/>
-                <w:lang w:bidi="ar"/>
-              </w:rPr>
-              <w:t>task_id</w:t>
-            </w:r>
-            <w:proofErr w:type="spellEnd"/>
-            <w:r>
-              <w:rPr>
-                <w:rFonts w:ascii="Times New Roman" w:eastAsia="Aptos" w:hAnsi="Times New Roman" w:cs="Times New Roman"/>
-                <w:kern w:val="2"/>
-                <w:sz w:val="24"/>
-                <w:szCs w:val="24"/>
-                <w:lang w:bidi="ar"/>
-              </w:rPr>
-              <w:t xml:space="preserve">, title, description, </w:t>
-            </w:r>
-            <w:proofErr w:type="spellStart"/>
-            <w:r>
-              <w:rPr>
-                <w:rFonts w:ascii="Times New Roman" w:eastAsia="Aptos" w:hAnsi="Times New Roman" w:cs="Times New Roman"/>
-                <w:kern w:val="2"/>
-                <w:sz w:val="24"/>
-                <w:szCs w:val="24"/>
-                <w:lang w:bidi="ar"/>
-              </w:rPr>
-              <w:t>creator_id</w:t>
-            </w:r>
-            <w:proofErr w:type="spellEnd"/>
-            <w:r>
-              <w:rPr>
-                <w:rFonts w:ascii="Times New Roman" w:eastAsia="Aptos" w:hAnsi="Times New Roman" w:cs="Times New Roman"/>
-                <w:kern w:val="2"/>
-                <w:sz w:val="24"/>
-                <w:szCs w:val="24"/>
-                <w:lang w:bidi="ar"/>
-              </w:rPr>
-              <w:t xml:space="preserve">, </w:t>
-            </w:r>
-            <w:proofErr w:type="spellStart"/>
-            <w:r>
-              <w:rPr>
-                <w:rFonts w:ascii="Times New Roman" w:eastAsia="Aptos" w:hAnsi="Times New Roman" w:cs="Times New Roman"/>
-                <w:kern w:val="2"/>
-                <w:sz w:val="24"/>
-                <w:szCs w:val="24"/>
-                <w:lang w:bidi="ar"/>
-              </w:rPr>
-              <w:t>executor_id</w:t>
-            </w:r>
-            <w:proofErr w:type="spellEnd"/>
-            <w:r>
-              <w:rPr>
-                <w:rFonts w:ascii="Times New Roman" w:eastAsia="Aptos" w:hAnsi="Times New Roman" w:cs="Times New Roman"/>
-                <w:kern w:val="2"/>
-                <w:sz w:val="24"/>
-                <w:szCs w:val="24"/>
-                <w:lang w:bidi="ar"/>
-              </w:rPr>
-              <w:t xml:space="preserve">, </w:t>
-            </w:r>
-            <w:proofErr w:type="spellStart"/>
-            <w:r>
-              <w:rPr>
-                <w:rFonts w:ascii="Times New Roman" w:eastAsia="Aptos" w:hAnsi="Times New Roman" w:cs="Times New Roman"/>
-                <w:kern w:val="2"/>
-                <w:sz w:val="24"/>
-                <w:szCs w:val="24"/>
-                <w:lang w:bidi="ar"/>
-              </w:rPr>
-              <w:t>status_id</w:t>
-            </w:r>
-            <w:proofErr w:type="spellEnd"/>
-            <w:r>
-              <w:rPr>
-                <w:rFonts w:ascii="Times New Roman" w:eastAsia="Aptos" w:hAnsi="Times New Roman" w:cs="Times New Roman"/>
-                <w:kern w:val="2"/>
-                <w:sz w:val="24"/>
-                <w:szCs w:val="24"/>
-                <w:lang w:bidi="ar"/>
-              </w:rPr>
-              <w:t xml:space="preserve">, priority, </w:t>
-            </w:r>
-            <w:proofErr w:type="spellStart"/>
-            <w:r>
-              <w:rPr>
-                <w:rFonts w:ascii="Times New Roman" w:eastAsia="Aptos" w:hAnsi="Times New Roman" w:cs="Times New Roman"/>
-                <w:kern w:val="2"/>
-                <w:sz w:val="24"/>
-                <w:szCs w:val="24"/>
-                <w:lang w:bidi="ar"/>
-              </w:rPr>
-              <w:t>created_at</w:t>
-            </w:r>
-            <w:proofErr w:type="spellEnd"/>
-            <w:r>
-              <w:rPr>
-                <w:rFonts w:ascii="Times New Roman" w:eastAsia="Aptos" w:hAnsi="Times New Roman" w:cs="Times New Roman"/>
-                <w:kern w:val="2"/>
-                <w:sz w:val="24"/>
-                <w:szCs w:val="24"/>
-                <w:lang w:bidi="ar"/>
-              </w:rPr>
-              <w:t xml:space="preserve">, </w:t>
-            </w:r>
-            <w:proofErr w:type="spellStart"/>
-            <w:r>
-              <w:rPr>
-                <w:rFonts w:ascii="Times New Roman" w:eastAsia="Aptos" w:hAnsi="Times New Roman" w:cs="Times New Roman"/>
-                <w:kern w:val="2"/>
-                <w:sz w:val="24"/>
-                <w:szCs w:val="24"/>
-                <w:lang w:bidi="ar"/>
-              </w:rPr>
-              <w:t>due_date</w:t>
-            </w:r>
-            <w:proofErr w:type="spellEnd"/>
-            <w:r>
-              <w:rPr>
-                <w:rFonts w:ascii="Times New Roman" w:eastAsia="Aptos" w:hAnsi="Times New Roman" w:cs="Times New Roman"/>
-                <w:kern w:val="2"/>
-                <w:sz w:val="24"/>
-                <w:szCs w:val="24"/>
-                <w:lang w:bidi="ar"/>
-              </w:rPr>
-              <w:t xml:space="preserve">, </w:t>
-            </w:r>
-            <w:proofErr w:type="spellStart"/>
-            <w:r>
-              <w:rPr>
-                <w:rFonts w:ascii="Times New Roman" w:eastAsia="Aptos" w:hAnsi="Times New Roman" w:cs="Times New Roman"/>
-                <w:kern w:val="2"/>
-                <w:sz w:val="24"/>
-                <w:szCs w:val="24"/>
-                <w:lang w:bidi="ar"/>
-              </w:rPr>
-              <w:t>completed_at</w:t>
-            </w:r>
-            <w:proofErr w:type="spellEnd"/>
-          </w:p>
-        </w:tc>
-      </w:tr>
-      <w:tr>
-        <w:tc>
-          <w:tcPr>
-            <w:tcW w:w="0" w:type="auto"/>
-            <w:hideMark/>
-          </w:tcPr>
-          <w:p>
-            <w:pPr>
-              <w:rPr>
-                <w:rFonts w:ascii="Times New Roman" w:eastAsia="Aptos" w:hAnsi="Times New Roman" w:cs="Times New Roman"/>
-                <w:kern w:val="2"/>
-                <w:sz w:val="24"/>
-                <w:szCs w:val="24"/>
-                <w:lang w:val="ru-RU" w:bidi="ar"/>
-              </w:rPr>
-            </w:pPr>
-            <w:r>
-              <w:rPr>
-                <w:rFonts w:ascii="Times New Roman" w:eastAsia="Aptos" w:hAnsi="Times New Roman" w:cs="Times New Roman"/>
-                <w:kern w:val="2"/>
-                <w:sz w:val="24"/>
-                <w:szCs w:val="24"/>
-                <w:lang w:val="ru-RU" w:bidi="ar"/>
-              </w:rPr>
-              <w:t>Управление поручениями</w:t>
-            </w:r>
-          </w:p>
-        </w:tc>
-        <w:tc>
-          <w:tcPr>
-            <w:tcW w:w="0" w:type="auto"/>
-            <w:hideMark/>
-          </w:tcPr>
-          <w:p>
-            <w:pPr>
-              <w:rPr>
-                <w:rFonts w:ascii="Times New Roman" w:eastAsia="Aptos" w:hAnsi="Times New Roman" w:cs="Times New Roman"/>
-                <w:kern w:val="2"/>
-                <w:sz w:val="24"/>
-                <w:szCs w:val="24"/>
-                <w:lang w:val="ru-RU" w:bidi="ar"/>
-              </w:rPr>
-            </w:pPr>
-            <w:proofErr w:type="spellStart"/>
-            <w:r>
-              <w:rPr>
-                <w:rFonts w:ascii="Times New Roman" w:eastAsia="Aptos" w:hAnsi="Times New Roman" w:cs="Times New Roman"/>
-                <w:kern w:val="2"/>
-                <w:sz w:val="24"/>
-                <w:szCs w:val="24"/>
-                <w:lang w:val="ru-RU" w:bidi="ar"/>
-              </w:rPr>
-              <w:t>status</w:t>
-            </w:r>
-            <w:proofErr w:type="spellEnd"/>
-          </w:p>
-        </w:tc>
-        <w:tc>
-          <w:tcPr>
-            <w:tcW w:w="0" w:type="auto"/>
-            <w:hideMark/>
-          </w:tcPr>
-          <w:p>
-            <w:pPr>
-              <w:rPr>
-                <w:rFonts w:ascii="Times New Roman" w:eastAsia="Aptos" w:hAnsi="Times New Roman" w:cs="Times New Roman"/>
-                <w:kern w:val="2"/>
-                <w:sz w:val="24"/>
-                <w:szCs w:val="24"/>
-                <w:lang w:bidi="ar"/>
-              </w:rPr>
-            </w:pPr>
-            <w:proofErr w:type="spellStart"/>
-            <w:r>
-              <w:rPr>
-                <w:rFonts w:ascii="Times New Roman" w:eastAsia="Aptos" w:hAnsi="Times New Roman" w:cs="Times New Roman"/>
-                <w:kern w:val="2"/>
-                <w:sz w:val="24"/>
-                <w:szCs w:val="24"/>
-                <w:lang w:bidi="ar"/>
-              </w:rPr>
-              <w:t>status_id</w:t>
-            </w:r>
-            <w:proofErr w:type="spellEnd"/>
-            <w:r>
-              <w:rPr>
-                <w:rFonts w:ascii="Times New Roman" w:eastAsia="Aptos" w:hAnsi="Times New Roman" w:cs="Times New Roman"/>
-                <w:kern w:val="2"/>
-                <w:sz w:val="24"/>
-                <w:szCs w:val="24"/>
-                <w:lang w:bidi="ar"/>
-              </w:rPr>
-              <w:t xml:space="preserve">, </w:t>
-            </w:r>
-            <w:proofErr w:type="spellStart"/>
-            <w:r>
-              <w:rPr>
-                <w:rFonts w:ascii="Times New Roman" w:eastAsia="Aptos" w:hAnsi="Times New Roman" w:cs="Times New Roman"/>
-                <w:kern w:val="2"/>
-                <w:sz w:val="24"/>
-                <w:szCs w:val="24"/>
-                <w:lang w:bidi="ar"/>
-              </w:rPr>
-              <w:t>status_name</w:t>
-            </w:r>
-            <w:proofErr w:type="spellEnd"/>
-            <w:r>
-              <w:rPr>
-                <w:rFonts w:ascii="Times New Roman" w:eastAsia="Aptos" w:hAnsi="Times New Roman" w:cs="Times New Roman"/>
-                <w:kern w:val="2"/>
-                <w:sz w:val="24"/>
-                <w:szCs w:val="24"/>
-                <w:lang w:bidi="ar"/>
-              </w:rPr>
-              <w:t xml:space="preserve"> (new, </w:t>
-            </w:r>
-            <w:proofErr w:type="spellStart"/>
-            <w:r>
-              <w:rPr>
-                <w:rFonts w:ascii="Times New Roman" w:eastAsia="Aptos" w:hAnsi="Times New Roman" w:cs="Times New Roman"/>
-                <w:kern w:val="2"/>
-                <w:sz w:val="24"/>
-                <w:szCs w:val="24"/>
-                <w:lang w:bidi="ar"/>
-              </w:rPr>
-              <w:t>in_progress</w:t>
-            </w:r>
-            <w:proofErr w:type="spellEnd"/>
-            <w:r>
-              <w:rPr>
-                <w:rFonts w:ascii="Times New Roman" w:eastAsia="Aptos" w:hAnsi="Times New Roman" w:cs="Times New Roman"/>
-                <w:kern w:val="2"/>
-                <w:sz w:val="24"/>
-                <w:szCs w:val="24"/>
-                <w:lang w:bidi="ar"/>
-              </w:rPr>
-              <w:t xml:space="preserve">, </w:t>
-            </w:r>
-            <w:proofErr w:type="spellStart"/>
-            <w:r>
-              <w:rPr>
-                <w:rFonts w:ascii="Times New Roman" w:eastAsia="Aptos" w:hAnsi="Times New Roman" w:cs="Times New Roman"/>
-                <w:kern w:val="2"/>
-                <w:sz w:val="24"/>
-                <w:szCs w:val="24"/>
-                <w:lang w:bidi="ar"/>
-              </w:rPr>
-              <w:t>on_review</w:t>
-            </w:r>
-            <w:proofErr w:type="spellEnd"/>
-            <w:r>
-              <w:rPr>
-                <w:rFonts w:ascii="Times New Roman" w:eastAsia="Aptos" w:hAnsi="Times New Roman" w:cs="Times New Roman"/>
-                <w:kern w:val="2"/>
-                <w:sz w:val="24"/>
-                <w:szCs w:val="24"/>
-                <w:lang w:bidi="ar"/>
-              </w:rPr>
-              <w:t>, completed, overdue)</w:t>
+              <w:t>department_id, department_name, parent_department_id</w:t>
             </w:r>
           </w:p>
         </w:tc>
@@ -1624,7 +1044,6 @@
                 <w:lang w:val="ru-RU" w:bidi="ar"/>
               </w:rPr>
             </w:pPr>
-            <w:proofErr w:type="spellStart"/>
             <w:r>
               <w:rPr>
                 <w:rFonts w:ascii="Times New Roman" w:eastAsia="Aptos" w:hAnsi="Times New Roman" w:cs="Times New Roman"/>
@@ -1633,9 +1052,8 @@
                 <w:szCs w:val="24"/>
                 <w:lang w:val="ru-RU" w:bidi="ar"/>
               </w:rPr>
-              <w:t>comment</w:t>
+              <w:t>task</w:t>
             </w:r>
-            <w:proofErr w:type="spellEnd"/>
           </w:p>
         </w:tc>
         <w:tc>
@@ -1653,7 +1071,6 @@
                 <w:lang w:bidi="ar"/>
               </w:rPr>
             </w:pPr>
-            <w:proofErr w:type="spellStart"/>
             <w:r>
               <w:rPr>
                 <w:rFonts w:ascii="Times New Roman" w:eastAsia="Aptos" w:hAnsi="Times New Roman" w:cs="Times New Roman"/>
@@ -1662,9 +1079,81 @@
                 <w:szCs w:val="24"/>
                 <w:lang w:bidi="ar"/>
               </w:rPr>
-              <w:t>comment_id</w:t>
+              <w:t>task_id, title, description, creator_id, executor_id, status_id, priority, created_at, due_date, completed_at</w:t>
             </w:r>
-            <w:proofErr w:type="spellEnd"/>
+          </w:p>
+        </w:tc>
+      </w:tr>
+      <w:tr>
+        <w:tc>
+          <w:tcPr>
+            <w:tcW w:w="0" w:type="auto"/>
+            <w:hideMark/>
+          </w:tcPr>
+          <w:p>
+            <w:pPr>
+              <w:rPr>
+                <w:rFonts w:ascii="Times New Roman" w:eastAsia="Aptos" w:hAnsi="Times New Roman" w:cs="Times New Roman"/>
+                <w:kern w:val="2"/>
+                <w:sz w:val="24"/>
+                <w:szCs w:val="24"/>
+                <w:lang w:val="ru-RU" w:bidi="ar"/>
+              </w:rPr>
+            </w:pPr>
+            <w:r>
+              <w:rPr>
+                <w:rFonts w:ascii="Times New Roman" w:eastAsia="Aptos" w:hAnsi="Times New Roman" w:cs="Times New Roman"/>
+                <w:kern w:val="2"/>
+                <w:sz w:val="24"/>
+                <w:szCs w:val="24"/>
+                <w:lang w:val="ru-RU" w:bidi="ar"/>
+              </w:rPr>
+              <w:t>Управление поручениями</w:t>
+            </w:r>
+          </w:p>
+        </w:tc>
+        <w:tc>
+          <w:tcPr>
+            <w:tcW w:w="0" w:type="auto"/>
+            <w:hideMark/>
+          </w:tcPr>
+          <w:p>
+            <w:pPr>
+              <w:rPr>
+                <w:rFonts w:ascii="Times New Roman" w:eastAsia="Aptos" w:hAnsi="Times New Roman" w:cs="Times New Roman"/>
+                <w:kern w:val="2"/>
+                <w:sz w:val="24"/>
+                <w:szCs w:val="24"/>
+                <w:lang w:val="ru-RU" w:bidi="ar"/>
+              </w:rPr>
+            </w:pPr>
+            <w:r>
+              <w:rPr>
+                <w:rFonts w:ascii="Times New Roman" w:eastAsia="Aptos" w:hAnsi="Times New Roman" w:cs="Times New Roman"/>
+                <w:kern w:val="2"/>
+                <w:sz w:val="24"/>
+                <w:szCs w:val="24"/>
+                <w:lang w:val="ru-RU" w:bidi="ar"/>
+              </w:rPr>
+              <w:t>status</w:t>
+            </w:r>
+          </w:p>
+        </w:tc>
+        <w:tc>
+          <w:tcPr>
+            <w:tcW w:w="0" w:type="auto"/>
+            <w:hideMark/>
+          </w:tcPr>
+          <w:p>
+            <w:pPr>
+              <w:rPr>
+                <w:rFonts w:ascii="Times New Roman" w:eastAsia="Aptos" w:hAnsi="Times New Roman" w:cs="Times New Roman"/>
+                <w:kern w:val="2"/>
+                <w:sz w:val="24"/>
+                <w:szCs w:val="24"/>
+                <w:lang w:bidi="ar"/>
+              </w:rPr>
+            </w:pPr>
             <w:r>
               <w:rPr>
                 <w:rFonts w:ascii="Times New Roman" w:eastAsia="Aptos" w:hAnsi="Times New Roman" w:cs="Times New Roman"/>
@@ -1673,9 +1162,81 @@
                 <w:szCs w:val="24"/>
                 <w:lang w:bidi="ar"/>
               </w:rPr>
-              <w:t xml:space="preserve">, </w:t>
+              <w:t>status_id, status_name (new, in_progress, on_review, completed, overdue)</w:t>
             </w:r>
-            <w:proofErr w:type="spellStart"/>
+          </w:p>
+        </w:tc>
+      </w:tr>
+      <w:tr>
+        <w:tc>
+          <w:tcPr>
+            <w:tcW w:w="0" w:type="auto"/>
+            <w:hideMark/>
+          </w:tcPr>
+          <w:p>
+            <w:pPr>
+              <w:rPr>
+                <w:rFonts w:ascii="Times New Roman" w:eastAsia="Aptos" w:hAnsi="Times New Roman" w:cs="Times New Roman"/>
+                <w:kern w:val="2"/>
+                <w:sz w:val="24"/>
+                <w:szCs w:val="24"/>
+                <w:lang w:val="ru-RU" w:bidi="ar"/>
+              </w:rPr>
+            </w:pPr>
+            <w:r>
+              <w:rPr>
+                <w:rFonts w:ascii="Times New Roman" w:eastAsia="Aptos" w:hAnsi="Times New Roman" w:cs="Times New Roman"/>
+                <w:kern w:val="2"/>
+                <w:sz w:val="24"/>
+                <w:szCs w:val="24"/>
+                <w:lang w:val="ru-RU" w:bidi="ar"/>
+              </w:rPr>
+              <w:t>Управление поручениями</w:t>
+            </w:r>
+          </w:p>
+        </w:tc>
+        <w:tc>
+          <w:tcPr>
+            <w:tcW w:w="0" w:type="auto"/>
+            <w:hideMark/>
+          </w:tcPr>
+          <w:p>
+            <w:pPr>
+              <w:rPr>
+                <w:rFonts w:ascii="Times New Roman" w:eastAsia="Aptos" w:hAnsi="Times New Roman" w:cs="Times New Roman"/>
+                <w:kern w:val="2"/>
+                <w:sz w:val="24"/>
+                <w:szCs w:val="24"/>
+                <w:lang w:val="ru-RU" w:bidi="ar"/>
+              </w:rPr>
+            </w:pPr>
+            <w:r>
+              <w:rPr>
+                <w:rFonts w:ascii="Times New Roman" w:eastAsia="Aptos" w:hAnsi="Times New Roman" w:cs="Times New Roman"/>
+                <w:kern w:val="2"/>
+                <w:sz w:val="24"/>
+                <w:szCs w:val="24"/>
+                <w:lang w:val="ru-RU" w:bidi="ar"/>
+              </w:rPr>
+              <w:t>comment</w:t>
+            </w:r>
+          </w:p>
+        </w:tc>
+        <w:tc>
+          <w:tcPr>
+            <w:tcW w:w="0" w:type="auto"/>
+            <w:hideMark/>
+          </w:tcPr>
+          <w:p>
+            <w:pPr>
+              <w:rPr>
+                <w:rFonts w:ascii="Times New Roman" w:eastAsia="Aptos" w:hAnsi="Times New Roman" w:cs="Times New Roman"/>
+                <w:kern w:val="2"/>
+                <w:sz w:val="24"/>
+                <w:szCs w:val="24"/>
+                <w:lang w:bidi="ar"/>
+              </w:rPr>
+            </w:pPr>
             <w:r>
               <w:rPr>
                 <w:rFonts w:ascii="Times New Roman" w:eastAsia="Aptos" w:hAnsi="Times New Roman" w:cs="Times New Roman"/>
@@ -1684,53 +1245,8 @@
                 <w:szCs w:val="24"/>
                 <w:lang w:bidi="ar"/>
               </w:rPr>
-              <w:t>task_id</w:t>
+              <w:t>comment_id, task_id, author_id, text, created_at</w:t>
             </w:r>
-            <w:proofErr w:type="spellEnd"/>
-            <w:r>
-              <w:rPr>
-                <w:rFonts w:ascii="Times New Roman" w:eastAsia="Aptos" w:hAnsi="Times New Roman" w:cs="Times New Roman"/>
-                <w:kern w:val="2"/>
-                <w:sz w:val="24"/>
-                <w:szCs w:val="24"/>
-                <w:lang w:bidi="ar"/>
-              </w:rPr>
-              <w:t xml:space="preserve">, </w:t>
-            </w:r>
-            <w:proofErr w:type="spellStart"/>
-            <w:r>
-              <w:rPr>
-                <w:rFonts w:ascii="Times New Roman" w:eastAsia="Aptos" w:hAnsi="Times New Roman" w:cs="Times New Roman"/>
-                <w:kern w:val="2"/>
-                <w:sz w:val="24"/>
-                <w:szCs w:val="24"/>
-                <w:lang w:bidi="ar"/>
-              </w:rPr>
-              <w:t>author_id</w:t>
-            </w:r>
-            <w:proofErr w:type="spellEnd"/>
-            <w:r>
-              <w:rPr>
-                <w:rFonts w:ascii="Times New Roman" w:eastAsia="Aptos" w:hAnsi="Times New Roman" w:cs="Times New Roman"/>
-                <w:kern w:val="2"/>
-                <w:sz w:val="24"/>
-                <w:szCs w:val="24"/>
-                <w:lang w:bidi="ar"/>
-              </w:rPr>
-              <w:t xml:space="preserve">, text, </w:t>
-            </w:r>
-            <w:proofErr w:type="spellStart"/>
-            <w:r>
-              <w:rPr>
-                <w:rFonts w:ascii="Times New Roman" w:eastAsia="Aptos" w:hAnsi="Times New Roman" w:cs="Times New Roman"/>
-                <w:kern w:val="2"/>
-                <w:sz w:val="24"/>
-                <w:szCs w:val="24"/>
-                <w:lang w:bidi="ar"/>
-              </w:rPr>
-              <w:t>created_at</w:t>
-            </w:r>
-            <w:proofErr w:type="spellEnd"/>
           </w:p>
         </w:tc>
       </w:tr>
@@ -1777,7 +1293,6 @@
                 <w:lang w:val="ru-RU" w:bidi="ar"/>
               </w:rPr>
             </w:pPr>
-            <w:proofErr w:type="spellStart"/>
             <w:r>
               <w:rPr>
                 <w:rFonts w:ascii="Times New Roman" w:eastAsia="Aptos" w:hAnsi="Times New Roman" w:cs="Times New Roman"/>
@@ -1788,7 +1303,6 @@
               </w:rPr>
               <w:t>event</w:t>
             </w:r>
-            <w:proofErr w:type="spellEnd"/>
           </w:p>
         </w:tc>
         <w:tc>
@@ -1806,7 +1320,6 @@
                 <w:lang w:bidi="ar"/>
               </w:rPr>
             </w:pPr>
-            <w:proofErr w:type="spellStart"/>
             <w:r>
               <w:rPr>
                 <w:rFonts w:ascii="Times New Roman" w:eastAsia="Aptos" w:hAnsi="Times New Roman" w:cs="Times New Roman"/>
@@ -1815,97 +1328,8 @@
                 <w:szCs w:val="24"/>
                 <w:lang w:bidi="ar"/>
               </w:rPr>
-              <w:t>event_id</w:t>
+              <w:t>event_id, user_id, title, start_datetime, end_datetime, event_type</w:t>
             </w:r>
-            <w:proofErr w:type="spellEnd"/>
-            <w:r>
-              <w:rPr>
-                <w:rFonts w:ascii="Times New Roman" w:eastAsia="Aptos" w:hAnsi="Times New Roman" w:cs="Times New Roman"/>
-                <w:kern w:val="2"/>
-                <w:sz w:val="24"/>
-                <w:szCs w:val="24"/>
-                <w:lang w:bidi="ar"/>
-              </w:rPr>
-              <w:t xml:space="preserve">, </w:t>
-            </w:r>
-            <w:proofErr w:type="spellStart"/>
-            <w:r>
-              <w:rPr>
-                <w:rFonts w:ascii="Times New Roman" w:eastAsia="Aptos" w:hAnsi="Times New Roman" w:cs="Times New Roman"/>
-                <w:kern w:val="2"/>
-                <w:sz w:val="24"/>
-                <w:szCs w:val="24"/>
-                <w:lang w:bidi="ar"/>
-              </w:rPr>
-              <w:t>user_id</w:t>
-            </w:r>
-            <w:proofErr w:type="spellEnd"/>
-            <w:r>
-              <w:rPr>
-                <w:rFonts w:ascii="Times New Roman" w:eastAsia="Aptos" w:hAnsi="Times New Roman" w:cs="Times New Roman"/>
-                <w:kern w:val="2"/>
-                <w:sz w:val="24"/>
-                <w:szCs w:val="24"/>
-                <w:lang w:bidi="ar"/>
-              </w:rPr>
-              <w:t xml:space="preserve">, title, </w:t>
-            </w:r>
-            <w:proofErr w:type="spellStart"/>
-            <w:r>
-              <w:rPr>
-                <w:rFonts w:ascii="Times New Roman" w:eastAsia="Aptos" w:hAnsi="Times New Roman" w:cs="Times New Roman"/>
-                <w:kern w:val="2"/>
-                <w:sz w:val="24"/>
-                <w:szCs w:val="24"/>
-                <w:lang w:bidi="ar"/>
-              </w:rPr>
-              <w:t>start_datetime</w:t>
-            </w:r>
-            <w:proofErr w:type="spellEnd"/>
-            <w:r>
-              <w:rPr>
-                <w:rFonts w:ascii="Times New Roman" w:eastAsia="Aptos" w:hAnsi="Times New Roman" w:cs="Times New Roman"/>
-                <w:kern w:val="2"/>
-                <w:sz w:val="24"/>
-                <w:szCs w:val="24"/>
-                <w:lang w:bidi="ar"/>
-              </w:rPr>
-              <w:t xml:space="preserve">, </w:t>
-            </w:r>
-            <w:proofErr w:type="spellStart"/>
-            <w:r>
-              <w:rPr>
-                <w:rFonts w:ascii="Times New Roman" w:eastAsia="Aptos" w:hAnsi="Times New Roman" w:cs="Times New Roman"/>
-                <w:kern w:val="2"/>
-                <w:sz w:val="24"/>
-                <w:szCs w:val="24"/>
-                <w:lang w:bidi="ar"/>
-              </w:rPr>
-              <w:t>end_datetime</w:t>
-            </w:r>
-            <w:proofErr w:type="spellEnd"/>
-            <w:r>
-              <w:rPr>
-                <w:rFonts w:ascii="Times New Roman" w:eastAsia="Aptos" w:hAnsi="Times New Roman" w:cs="Times New Roman"/>
-                <w:kern w:val="2"/>
-                <w:sz w:val="24"/>
-                <w:szCs w:val="24"/>
-                <w:lang w:bidi="ar"/>
-              </w:rPr>
-              <w:t xml:space="preserve">, </w:t>
-            </w:r>
-            <w:proofErr w:type="spellStart"/>
-            <w:r>
-              <w:rPr>
-                <w:rFonts w:ascii="Times New Roman" w:eastAsia="Aptos" w:hAnsi="Times New Roman" w:cs="Times New Roman"/>
-                <w:kern w:val="2"/>
-                <w:sz w:val="24"/>
-                <w:szCs w:val="24"/>
-                <w:lang w:bidi="ar"/>
-              </w:rPr>
-              <w:t>event_type</w:t>
-            </w:r>
-            <w:proofErr w:type="spellEnd"/>
           </w:p>
         </w:tc>
       </w:tr>
@@ -1952,7 +1376,6 @@
                 <w:lang w:val="ru-RU" w:bidi="ar"/>
               </w:rPr>
             </w:pPr>
-            <w:proofErr w:type="spellStart"/>
             <w:r>
               <w:rPr>
                 <w:rFonts w:ascii="Times New Roman" w:eastAsia="Aptos" w:hAnsi="Times New Roman" w:cs="Times New Roman"/>
@@ -1963,7 +1386,6 @@
               </w:rPr>
               <w:t>report</w:t>
             </w:r>
-            <w:proofErr w:type="spellEnd"/>
           </w:p>
         </w:tc>
         <w:tc>
@@ -1981,7 +1403,6 @@
                 <w:lang w:bidi="ar"/>
               </w:rPr>
             </w:pPr>
-            <w:proofErr w:type="spellStart"/>
             <w:r>
               <w:rPr>
                 <w:rFonts w:ascii="Times New Roman" w:eastAsia="Aptos" w:hAnsi="Times New Roman" w:cs="Times New Roman"/>
@@ -1990,119 +1411,8 @@
                 <w:szCs w:val="24"/>
                 <w:lang w:bidi="ar"/>
               </w:rPr>
-              <w:t>report_id</w:t>
+              <w:t>report_id, report_type, period_start, period_end, generated_at, generated_by</w:t>
             </w:r>
-            <w:proofErr w:type="spellEnd"/>
-            <w:r>
-              <w:rPr>
-                <w:rFonts w:ascii="Times New Roman" w:eastAsia="Aptos" w:hAnsi="Times New Roman" w:cs="Times New Roman"/>
-                <w:kern w:val="2"/>
-                <w:sz w:val="24"/>
-                <w:szCs w:val="24"/>
-                <w:lang w:bidi="ar"/>
-              </w:rPr>
-              <w:t xml:space="preserve">, </w:t>
-            </w:r>
-            <w:proofErr w:type="spellStart"/>
-            <w:r>
-              <w:rPr>
-                <w:rFonts w:ascii="Times New Roman" w:eastAsia="Aptos" w:hAnsi="Times New Roman" w:cs="Times New Roman"/>
-                <w:kern w:val="2"/>
-                <w:sz w:val="24"/>
-                <w:szCs w:val="24"/>
-                <w:lang w:bidi="ar"/>
-              </w:rPr>
-              <w:t>report_type</w:t>
-            </w:r>
-            <w:proofErr w:type="spellEnd"/>
-            <w:r>
-              <w:rPr>
-                <w:rFonts w:ascii="Times New Roman" w:eastAsia="Aptos" w:hAnsi="Times New Roman" w:cs="Times New Roman"/>
-                <w:kern w:val="2"/>
-                <w:sz w:val="24"/>
-                <w:szCs w:val="24"/>
-                <w:lang w:bidi="ar"/>
-              </w:rPr>
-              <w:t xml:space="preserve">, </w:t>
-            </w:r>
-            <w:proofErr w:type="spellStart"/>
-            <w:r>
-              <w:rPr>
-                <w:rFonts w:ascii="Times New Roman" w:eastAsia="Aptos" w:hAnsi="Times New Roman" w:cs="Times New Roman"/>
-                <w:kern w:val="2"/>
-                <w:sz w:val="24"/>
-                <w:szCs w:val="24"/>
-                <w:lang w:bidi="ar"/>
-              </w:rPr>
-              <w:t>period_start</w:t>
-            </w:r>
-            <w:proofErr w:type="spellEnd"/>
-            <w:r>
-              <w:rPr>
-                <w:rFonts w:ascii="Times New Roman" w:eastAsia="Aptos" w:hAnsi="Times New Roman" w:cs="Times New Roman"/>
-                <w:kern w:val="2"/>
-                <w:sz w:val="24"/>
-                <w:szCs w:val="24"/>
-                <w:lang w:bidi="ar"/>
-              </w:rPr>
-              <w:t xml:space="preserve">, </w:t>
-            </w:r>
-            <w:proofErr w:type="spellStart"/>
-            <w:r>
-              <w:rPr>
-                <w:rFonts w:ascii="Times New Roman" w:eastAsia="Aptos" w:hAnsi="Times New Roman" w:cs="Times New Roman"/>
-                <w:kern w:val="2"/>
-                <w:sz w:val="24"/>
-                <w:szCs w:val="24"/>
-                <w:lang w:bidi="ar"/>
-              </w:rPr>
-              <w:t>period_end</w:t>
-            </w:r>
-            <w:proofErr w:type="spellEnd"/>
-            <w:r>
-              <w:rPr>
-                <w:rFonts w:ascii="Times New Roman" w:eastAsia="Aptos" w:hAnsi="Times New Roman" w:cs="Times New Roman"/>
-                <w:kern w:val="2"/>
-                <w:sz w:val="24"/>
-                <w:szCs w:val="24"/>
-                <w:lang w:bidi="ar"/>
-              </w:rPr>
-              <w:t xml:space="preserve">, </w:t>
-            </w:r>
-            <w:proofErr w:type="spellStart"/>
-            <w:r>
-              <w:rPr>
-                <w:rFonts w:ascii="Times New Roman" w:eastAsia="Aptos" w:hAnsi="Times New Roman" w:cs="Times New Roman"/>
-                <w:kern w:val="2"/>
-                <w:sz w:val="24"/>
-                <w:szCs w:val="24"/>
-                <w:lang w:bidi="ar"/>
-              </w:rPr>
-              <w:t>generated_at</w:t>
-            </w:r>
-            <w:proofErr w:type="spellEnd"/>
-            <w:r>
-              <w:rPr>
-                <w:rFonts w:ascii="Times New Roman" w:eastAsia="Aptos" w:hAnsi="Times New Roman" w:cs="Times New Roman"/>
-                <w:kern w:val="2"/>
-                <w:sz w:val="24"/>
-                <w:szCs w:val="24"/>
-                <w:lang w:bidi="ar"/>
-              </w:rPr>
-              <w:t xml:space="preserve">, </w:t>
-            </w:r>
-            <w:proofErr w:type="spellStart"/>
-            <w:r>
-              <w:rPr>
-                <w:rFonts w:ascii="Times New Roman" w:eastAsia="Aptos" w:hAnsi="Times New Roman" w:cs="Times New Roman"/>
-                <w:kern w:val="2"/>
-                <w:sz w:val="24"/>
-                <w:szCs w:val="24"/>
-                <w:lang w:bidi="ar"/>
-              </w:rPr>
-              <w:t>generated_by</w:t>
-            </w:r>
-            <w:proofErr w:type="spellEnd"/>
           </w:p>
         </w:tc>
       </w:tr>
@@ -2149,7 +1459,6 @@
                 <w:lang w:val="ru-RU" w:bidi="ar"/>
               </w:rPr>
             </w:pPr>
-            <w:proofErr w:type="spellStart"/>
             <w:r>
               <w:rPr>
                 <w:rFonts w:ascii="Times New Roman" w:eastAsia="Aptos" w:hAnsi="Times New Roman" w:cs="Times New Roman"/>
@@ -2160,7 +1469,6 @@
               </w:rPr>
               <w:t>audit_log</w:t>
             </w:r>
-            <w:proofErr w:type="spellEnd"/>
           </w:p>
         </w:tc>
         <w:tc>
@@ -2178,7 +1486,6 @@
                 <w:lang w:bidi="ar"/>
               </w:rPr>
             </w:pPr>
-            <w:proofErr w:type="spellStart"/>
             <w:r>
               <w:rPr>
                 <w:rFonts w:ascii="Times New Roman" w:eastAsia="Aptos" w:hAnsi="Times New Roman" w:cs="Times New Roman"/>
@@ -2187,131 +1494,8 @@
                 <w:szCs w:val="24"/>
                 <w:lang w:bidi="ar"/>
               </w:rPr>
-              <w:t>log_id</w:t>
+              <w:t>log_id, user_id, action_type, object_type, object_id, timestamp, ip_address</w:t>
             </w:r>
-            <w:proofErr w:type="spellEnd"/>
-            <w:r>
-              <w:rPr>
-                <w:rFonts w:ascii="Times New Roman" w:eastAsia="Aptos" w:hAnsi="Times New Roman" w:cs="Times New Roman"/>
-                <w:kern w:val="2"/>
-                <w:sz w:val="24"/>
-                <w:szCs w:val="24"/>
-                <w:lang w:bidi="ar"/>
-              </w:rPr>
-              <w:t xml:space="preserve">, </w:t>
-            </w:r>
-            <w:proofErr w:type="spellStart"/>
-            <w:r>
-              <w:rPr>
-                <w:rFonts w:ascii="Times New Roman" w:eastAsia="Aptos" w:hAnsi="Times New Roman" w:cs="Times New Roman"/>
-                <w:kern w:val="2"/>
-                <w:sz w:val="24"/>
-                <w:szCs w:val="24"/>
-                <w:lang w:bidi="ar"/>
-              </w:rPr>
-              <w:t>user_id</w:t>
-            </w:r>
-            <w:proofErr w:type="spellEnd"/>
-            <w:r>
-              <w:rPr>
-                <w:rFonts w:ascii="Times New Roman" w:eastAsia="Aptos" w:hAnsi="Times New Roman" w:cs="Times New Roman"/>
-                <w:kern w:val="2"/>
-                <w:sz w:val="24"/>
-                <w:szCs w:val="24"/>
-                <w:lang w:bidi="ar"/>
-              </w:rPr>
-              <w:t xml:space="preserve">, </w:t>
-            </w:r>
-            <w:proofErr w:type="spellStart"/>
-            <w:proofErr w:type="gramStart"/>
-            <w:r>
-              <w:rPr>
-                <w:rFonts w:ascii="Times New Roman" w:eastAsia="Aptos" w:hAnsi="Times New Roman" w:cs="Times New Roman"/>
-                <w:kern w:val="2"/>
-                <w:sz w:val="24"/>
-                <w:szCs w:val="24"/>
-                <w:lang w:bidi="ar"/>
-              </w:rPr>
-              <w:t>action</w:t>
-            </w:r>
-            <w:proofErr w:type="gramEnd"/>
-            <w:r>
-              <w:rPr>
-                <w:rFonts w:ascii="Times New Roman" w:eastAsia="Aptos" w:hAnsi="Times New Roman" w:cs="Times New Roman"/>
-                <w:kern w:val="2"/>
-                <w:sz w:val="24"/>
-                <w:szCs w:val="24"/>
-                <w:lang w:bidi="ar"/>
-              </w:rPr>
-              <w:t>_type</w:t>
-            </w:r>
-            <w:proofErr w:type="spellEnd"/>
-            <w:r>
-              <w:rPr>
-                <w:rFonts w:ascii="Times New Roman" w:eastAsia="Aptos" w:hAnsi="Times New Roman" w:cs="Times New Roman"/>
-                <w:kern w:val="2"/>
-                <w:sz w:val="24"/>
-                <w:szCs w:val="24"/>
-                <w:lang w:bidi="ar"/>
-              </w:rPr>
-              <w:t xml:space="preserve">, </w:t>
-            </w:r>
-            <w:proofErr w:type="spellStart"/>
-            <w:r>
-              <w:rPr>
-                <w:rFonts w:ascii="Times New Roman" w:eastAsia="Aptos" w:hAnsi="Times New Roman" w:cs="Times New Roman"/>
-                <w:kern w:val="2"/>
-                <w:sz w:val="24"/>
-                <w:szCs w:val="24"/>
-                <w:lang w:bidi="ar"/>
-              </w:rPr>
-              <w:t>object_type</w:t>
-            </w:r>
-            <w:proofErr w:type="spellEnd"/>
-            <w:r>
-              <w:rPr>
-                <w:rFonts w:ascii="Times New Roman" w:eastAsia="Aptos" w:hAnsi="Times New Roman" w:cs="Times New Roman"/>
-                <w:kern w:val="2"/>
-                <w:sz w:val="24"/>
-                <w:szCs w:val="24"/>
-                <w:lang w:bidi="ar"/>
-              </w:rPr>
-              <w:t xml:space="preserve">, </w:t>
-            </w:r>
-            <w:proofErr w:type="spellStart"/>
-            <w:r>
-              <w:rPr>
-                <w:rFonts w:ascii="Times New Roman" w:eastAsia="Aptos" w:hAnsi="Times New Roman" w:cs="Times New Roman"/>
-                <w:kern w:val="2"/>
-                <w:sz w:val="24"/>
-                <w:szCs w:val="24"/>
-                <w:lang w:bidi="ar"/>
-              </w:rPr>
-              <w:t>object_id</w:t>
-            </w:r>
-            <w:proofErr w:type="spellEnd"/>
-            <w:r>
-              <w:rPr>
-                <w:rFonts w:ascii="Times New Roman" w:eastAsia="Aptos" w:hAnsi="Times New Roman" w:cs="Times New Roman"/>
-                <w:kern w:val="2"/>
-                <w:sz w:val="24"/>
-                <w:szCs w:val="24"/>
-                <w:lang w:bidi="ar"/>
-              </w:rPr>
-              <w:t xml:space="preserve">, timestamp, </w:t>
-            </w:r>
-            <w:proofErr w:type="spellStart"/>
-            <w:r>
-              <w:rPr>
-                <w:rFonts w:ascii="Times New Roman" w:eastAsia="Aptos" w:hAnsi="Times New Roman" w:cs="Times New Roman"/>
-                <w:kern w:val="2"/>
-                <w:sz w:val="24"/>
-                <w:szCs w:val="24"/>
-                <w:lang w:bidi="ar"/>
-              </w:rPr>
-              <w:t>ip_address</w:t>
-            </w:r>
-            <w:proofErr w:type="spellEnd"/>
           </w:p>
         </w:tc>
       </w:tr>
@@ -2538,31 +1722,7 @@
           <w:shd w:val="clear" w:color="auto" w:fill="FFFFFF"/>
           <w:lang w:val="ru-RU"/>
         </w:rPr>
-        <w:t>Роль (</w:t>
-      </w:r>
-      <w:proofErr w:type="spellStart"/>
-      <w:r>
-        <w:rPr>
-          <w:rFonts w:ascii="Times New Roman" w:hAnsi="Times New Roman"/>
-          <w:color w:val="000000"/>
-          <w:sz w:val="28"/>
-          <w:szCs w:val="28"/>
-          <w:shd w:val="clear" w:color="auto" w:fill="FFFFFF"/>
-          <w:lang w:val="ru-RU"/>
-        </w:rPr>
-        <w:t>Role</w:t>
-      </w:r>
-      <w:proofErr w:type="spellEnd"/>
-      <w:r>
-        <w:rPr>
-          <w:rFonts w:ascii="Times New Roman" w:hAnsi="Times New Roman"/>
-          <w:color w:val="000000"/>
-          <w:sz w:val="28"/>
-          <w:szCs w:val="28"/>
-          <w:shd w:val="clear" w:color="auto" w:fill="FFFFFF"/>
-          <w:lang w:val="ru-RU"/>
-        </w:rPr>
-        <w:t>) – совокупность прав и ограничений доступа к функциям и данным системы, назначаемая пользователю в соответствии с его должностными обязанностями.</w:t>
+        <w:t>Роль (Role) – совокупность прав и ограничений доступа к функциям и данным системы, назначаемая пользователю в соответствии с его должностными обязанностями.</w:t>
       </w:r>
     </w:p>
     <w:p>
@@ -2594,31 +1754,7 @@
           <w:shd w:val="clear" w:color="auto" w:fill="FFFFFF"/>
           <w:lang w:val="ru-RU"/>
         </w:rPr>
-        <w:t>RBAC (</w:t>
-      </w:r>
-      <w:proofErr w:type="spellStart"/>
-      <w:r>
-        <w:rPr>
-          <w:rFonts w:ascii="Times New Roman" w:hAnsi="Times New Roman"/>
-          <w:color w:val="000000"/>
-          <w:sz w:val="28"/>
-          <w:szCs w:val="28"/>
-          <w:shd w:val="clear" w:color="auto" w:fill="FFFFFF"/>
-          <w:lang w:val="ru-RU"/>
-        </w:rPr>
-        <w:t>Role</w:t>
-      </w:r>
-      <w:proofErr w:type="spellEnd"/>
-      <w:r>
-        <w:rPr>
-          <w:rFonts w:ascii="Times New Roman" w:hAnsi="Times New Roman"/>
-          <w:color w:val="000000"/>
-          <w:sz w:val="28"/>
-          <w:szCs w:val="28"/>
-          <w:shd w:val="clear" w:color="auto" w:fill="FFFFFF"/>
-          <w:lang w:val="ru-RU"/>
-        </w:rPr>
-        <w:t>-Based Access Control) – модель разграничения доступа, основанная на назначении прав пользователям через роли.</w:t>
+        <w:t>RBAC (Role-Based Access Control) – модель разграничения доступа, основанная на назначении прав пользователям через роли.</w:t>
       </w:r>
     </w:p>
     <w:p>
@@ -2843,55 +1979,7 @@
           <w:lang w:val="ru-RU"/>
         </w:rPr>
         <w:lastRenderedPageBreak/>
-        <w:t>Журнал аудита (</w:t>
-      </w:r>
-      <w:proofErr w:type="spellStart"/>
-      <w:r>
-        <w:rPr>
-          <w:rFonts w:ascii="Times New Roman" w:hAnsi="Times New Roman"/>
-          <w:color w:val="000000"/>
-          <w:sz w:val="28"/>
-          <w:szCs w:val="28"/>
-          <w:shd w:val="clear" w:color="auto" w:fill="FFFFFF"/>
-          <w:lang w:val="ru-RU"/>
-        </w:rPr>
-        <w:t>Audit</w:t>
-      </w:r>
-      <w:proofErr w:type="spellEnd"/>
-      <w:r>
-        <w:rPr>
-          <w:rFonts w:ascii="Times New Roman" w:hAnsi="Times New Roman"/>
-          <w:color w:val="000000"/>
-          <w:sz w:val="28"/>
-          <w:szCs w:val="28"/>
-          <w:shd w:val="clear" w:color="auto" w:fill="FFFFFF"/>
-          <w:lang w:val="ru-RU"/>
-        </w:rPr>
-        <w:t xml:space="preserve"> </w:t>
-      </w:r>
-      <w:proofErr w:type="spellStart"/>
-      <w:r>
-        <w:rPr>
-          <w:rFonts w:ascii="Times New Roman" w:hAnsi="Times New Roman"/>
-          <w:color w:val="000000"/>
-          <w:sz w:val="28"/>
-          <w:szCs w:val="28"/>
-          <w:shd w:val="clear" w:color="auto" w:fill="FFFFFF"/>
-          <w:lang w:val="ru-RU"/>
-        </w:rPr>
-        <w:t>Log</w:t>
-      </w:r>
-      <w:proofErr w:type="spellEnd"/>
-      <w:r>
-        <w:rPr>
-          <w:rFonts w:ascii="Times New Roman" w:hAnsi="Times New Roman"/>
-          <w:color w:val="000000"/>
-          <w:sz w:val="28"/>
-          <w:szCs w:val="28"/>
-          <w:shd w:val="clear" w:color="auto" w:fill="FFFFFF"/>
-          <w:lang w:val="ru-RU"/>
-        </w:rPr>
-        <w:t>) – системный механизм регистрации действий пользователей с фиксацией времени, типа действия и объекта воздействия.</w:t>
+        <w:t>Журнал аудита (Audit Log) – системный механизм регистрации действий пользователей с фиксацией времени, типа действия и объекта воздействия.</w:t>
       </w:r>
     </w:p>
     <w:p>
@@ -2955,31 +2043,7 @@
           <w:shd w:val="clear" w:color="auto" w:fill="FFFFFF"/>
           <w:lang w:val="ru-RU"/>
         </w:rPr>
-        <w:t xml:space="preserve">API (Application </w:t>
-      </w:r>
-      <w:proofErr w:type="spellStart"/>
-      <w:r>
-        <w:rPr>
-          <w:rFonts w:ascii="Times New Roman" w:hAnsi="Times New Roman"/>
-          <w:color w:val="000000"/>
-          <w:sz w:val="28"/>
-          <w:szCs w:val="28"/>
-          <w:shd w:val="clear" w:color="auto" w:fill="FFFFFF"/>
-          <w:lang w:val="ru-RU"/>
-        </w:rPr>
-        <w:t>Programming</w:t>
-      </w:r>
-      <w:proofErr w:type="spellEnd"/>
-      <w:r>
-        <w:rPr>
-          <w:rFonts w:ascii="Times New Roman" w:hAnsi="Times New Roman"/>
-          <w:color w:val="000000"/>
-          <w:sz w:val="28"/>
-          <w:szCs w:val="28"/>
-          <w:shd w:val="clear" w:color="auto" w:fill="FFFFFF"/>
-          <w:lang w:val="ru-RU"/>
-        </w:rPr>
-        <w:t xml:space="preserve"> Interface) – программный интерфейс взаимодействия системы с внешними сервисами или модулями.</w:t>
+        <w:t>API (Application Programming Interface) – программный интерфейс взаимодействия системы с внешними сервисами или модулями.</w:t>
       </w:r>
     </w:p>
     <w:p>
@@ -3011,31 +2075,7 @@
           <w:shd w:val="clear" w:color="auto" w:fill="FFFFFF"/>
           <w:lang w:val="ru-RU"/>
         </w:rPr>
-        <w:t>REST (</w:t>
-      </w:r>
-      <w:proofErr w:type="spellStart"/>
-      <w:r>
-        <w:rPr>
-          <w:rFonts w:ascii="Times New Roman" w:hAnsi="Times New Roman"/>
-          <w:color w:val="000000"/>
-          <w:sz w:val="28"/>
-          <w:szCs w:val="28"/>
-          <w:shd w:val="clear" w:color="auto" w:fill="FFFFFF"/>
-          <w:lang w:val="ru-RU"/>
-        </w:rPr>
-        <w:t>Representational</w:t>
-      </w:r>
-      <w:proofErr w:type="spellEnd"/>
-      <w:r>
-        <w:rPr>
-          <w:rFonts w:ascii="Times New Roman" w:hAnsi="Times New Roman"/>
-          <w:color w:val="000000"/>
-          <w:sz w:val="28"/>
-          <w:szCs w:val="28"/>
-          <w:shd w:val="clear" w:color="auto" w:fill="FFFFFF"/>
-          <w:lang w:val="ru-RU"/>
-        </w:rPr>
-        <w:t xml:space="preserve"> State Transfer) – архитектурный стиль построения веб-сервисов, основанный на использовании стандартных HTTP-методов.</w:t>
+        <w:t>REST (Representational State Transfer) – архитектурный стиль построения веб-сервисов, основанный на использовании стандартных HTTP-методов.</w:t>
       </w:r>
     </w:p>
     <w:p>
@@ -3067,31 +2107,7 @@
           <w:shd w:val="clear" w:color="auto" w:fill="FFFFFF"/>
           <w:lang w:val="ru-RU"/>
         </w:rPr>
-        <w:t>HTTPS (</w:t>
-      </w:r>
-      <w:proofErr w:type="spellStart"/>
-      <w:r>
-        <w:rPr>
-          <w:rFonts w:ascii="Times New Roman" w:hAnsi="Times New Roman"/>
-          <w:color w:val="000000"/>
-          <w:sz w:val="28"/>
-          <w:szCs w:val="28"/>
-          <w:shd w:val="clear" w:color="auto" w:fill="FFFFFF"/>
-          <w:lang w:val="ru-RU"/>
-        </w:rPr>
-        <w:t>HyperText</w:t>
-      </w:r>
-      <w:proofErr w:type="spellEnd"/>
-      <w:r>
-        <w:rPr>
-          <w:rFonts w:ascii="Times New Roman" w:hAnsi="Times New Roman"/>
-          <w:color w:val="000000"/>
-          <w:sz w:val="28"/>
-          <w:szCs w:val="28"/>
-          <w:shd w:val="clear" w:color="auto" w:fill="FFFFFF"/>
-          <w:lang w:val="ru-RU"/>
-        </w:rPr>
-        <w:t xml:space="preserve"> Transfer Protocol Secure) – защищённый протокол передачи данных между клиентом и сервером с использованием криптографического шифрования.</w:t>
+        <w:t>HTTPS (HyperText Transfer Protocol Secure) – защищённый протокол передачи данных между клиентом и сервером с использованием криптографического шифрования.</w:t>
       </w:r>
     </w:p>
     <w:p>
@@ -3207,34 +2223,14 @@
           <w:szCs w:val="28"/>
         </w:rPr>
       </w:pPr>
-      <w:proofErr w:type="spellStart"/>
       <w:r>
         <w:rPr>
           <w:rFonts w:ascii="Times New Roman" w:hAnsi="Times New Roman"/>
           <w:sz w:val="28"/>
           <w:szCs w:val="28"/>
         </w:rPr>
-        <w:t>Анализ</w:t>
-      </w:r>
-      <w:proofErr w:type="spellEnd"/>
-      <w:r>
-        <w:rPr>
-          <w:rFonts w:ascii="Times New Roman" w:hAnsi="Times New Roman"/>
-          <w:sz w:val="28"/>
-          <w:szCs w:val="28"/>
-        </w:rPr>
-        <w:t xml:space="preserve"> </w:t>
-      </w:r>
-      <w:proofErr w:type="spellStart"/>
-      <w:r>
-        <w:rPr>
-          <w:rFonts w:ascii="Times New Roman" w:hAnsi="Times New Roman"/>
-          <w:sz w:val="28"/>
-          <w:szCs w:val="28"/>
-        </w:rPr>
-        <w:t>требований</w:t>
-      </w:r>
-      <w:proofErr w:type="spellEnd"/>
+        <w:t>Анализ требований</w:t>
+      </w:r>
     </w:p>
     <w:p>
       <w:pPr>
@@ -3255,27 +2251,7 @@
           <w:szCs w:val="28"/>
           <w:lang w:val="ru-RU"/>
         </w:rPr>
-        <w:t xml:space="preserve">Конфиденциальные (Персональные данные – </w:t>
-      </w:r>
-      <w:proofErr w:type="spellStart"/>
-      <w:r>
-        <w:rPr>
-          <w:rFonts w:ascii="Times New Roman" w:hAnsi="Times New Roman" w:cs="Times New Roman"/>
-          <w:sz w:val="28"/>
-          <w:szCs w:val="28"/>
-          <w:lang w:val="ru-RU"/>
-        </w:rPr>
-        <w:t>ПДн</w:t>
-      </w:r>
-      <w:proofErr w:type="spellEnd"/>
-      <w:r>
-        <w:rPr>
-          <w:rFonts w:ascii="Times New Roman" w:hAnsi="Times New Roman" w:cs="Times New Roman"/>
-          <w:sz w:val="28"/>
-          <w:szCs w:val="28"/>
-          <w:lang w:val="ru-RU"/>
-        </w:rPr>
-        <w:t>)</w:t>
+        <w:t>Конфиденциальные (Персональные данные – ПДн)</w:t>
       </w:r>
     </w:p>
     <w:p>
@@ -3297,27 +2273,7 @@
           <w:szCs w:val="28"/>
           <w:lang w:val="ru-RU"/>
         </w:rPr>
-        <w:t xml:space="preserve">ФИО сотрудников, должность, контактные данные (телефон, </w:t>
-      </w:r>
-      <w:proofErr w:type="spellStart"/>
-      <w:r>
-        <w:rPr>
-          <w:rFonts w:ascii="Times New Roman" w:hAnsi="Times New Roman" w:cs="Times New Roman"/>
-          <w:sz w:val="28"/>
-          <w:szCs w:val="28"/>
-          <w:lang w:val="ru-RU"/>
-        </w:rPr>
-        <w:t>email</w:t>
-      </w:r>
-      <w:proofErr w:type="spellEnd"/>
-      <w:r>
-        <w:rPr>
-          <w:rFonts w:ascii="Times New Roman" w:hAnsi="Times New Roman" w:cs="Times New Roman"/>
-          <w:sz w:val="28"/>
-          <w:szCs w:val="28"/>
-          <w:lang w:val="ru-RU"/>
-        </w:rPr>
-        <w:t>), логины пользователей, сведения о служебной деятельности (история поручений), IP-адреса подключений.</w:t>
+        <w:t>ФИО сотрудников, должность, контактные данные (телефон, email), логины пользователей, сведения о служебной деятельности (история поручений), IP-адреса подключений.</w:t>
       </w:r>
     </w:p>
     <w:p>
@@ -4271,27 +3227,7 @@
           <w:szCs w:val="28"/>
           <w:lang w:val="ru-RU"/>
         </w:rPr>
-        <w:t xml:space="preserve">ограничение круга лиц, имеющих доступ к </w:t>
-      </w:r>
-      <w:proofErr w:type="spellStart"/>
-      <w:r>
-        <w:rPr>
-          <w:rFonts w:ascii="Times New Roman" w:hAnsi="Times New Roman" w:cs="Times New Roman"/>
-          <w:sz w:val="28"/>
-          <w:szCs w:val="28"/>
-          <w:lang w:val="ru-RU"/>
-        </w:rPr>
-        <w:t>ПДн</w:t>
-      </w:r>
-      <w:proofErr w:type="spellEnd"/>
-      <w:r>
-        <w:rPr>
-          <w:rFonts w:ascii="Times New Roman" w:hAnsi="Times New Roman" w:cs="Times New Roman"/>
-          <w:sz w:val="28"/>
-          <w:szCs w:val="28"/>
-          <w:lang w:val="ru-RU"/>
-        </w:rPr>
-        <w:t>;</w:t>
+        <w:t>ограничение круга лиц, имеющих доступ к ПДн;</w:t>
       </w:r>
     </w:p>
     <w:p>
@@ -4317,27 +3253,7 @@
           <w:szCs w:val="28"/>
           <w:lang w:val="ru-RU"/>
         </w:rPr>
-        <w:t xml:space="preserve">хранение </w:t>
-      </w:r>
-      <w:proofErr w:type="spellStart"/>
-      <w:r>
-        <w:rPr>
-          <w:rFonts w:ascii="Times New Roman" w:hAnsi="Times New Roman" w:cs="Times New Roman"/>
-          <w:sz w:val="28"/>
-          <w:szCs w:val="28"/>
-          <w:lang w:val="ru-RU"/>
-        </w:rPr>
-        <w:t>ПДн</w:t>
-      </w:r>
-      <w:proofErr w:type="spellEnd"/>
-      <w:r>
-        <w:rPr>
-          <w:rFonts w:ascii="Times New Roman" w:hAnsi="Times New Roman" w:cs="Times New Roman"/>
-          <w:sz w:val="28"/>
-          <w:szCs w:val="28"/>
-          <w:lang w:val="ru-RU"/>
-        </w:rPr>
-        <w:t xml:space="preserve"> на территории Российской Федерации (в случае облачного размещения — использование российских дата-центров);</w:t>
+        <w:t>хранение ПДн на территории Российской Федерации (в случае облачного размещения — использование российских дата-центров);</w:t>
       </w:r>
     </w:p>
     <w:p>
@@ -4699,7 +3615,7 @@
           </mc:Choice>
           <mc:Fallback>
             <w:pict>
-              <v:line w14:anchorId="3D1C7D27" id="Straight Connector 6" o:spid="_x0000_s1026" style="position:absolute;z-index:251659264;visibility:visible;mso-wrap-style:square;mso-wrap-distance-left:9pt;mso-wrap-distance-top:0;mso-wrap-distance-right:9pt;mso-wrap-distance-bottom:0;mso-position-horizontal:absolute;mso-position-horizontal-relative:text;mso-position-vertical:absolute;mso-position-vertical-relative:text" from="1pt,122.1pt" to="1pt,146.2pt" o:gfxdata="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" strokecolor="black [3213]">
+              <v:line w14:anchorId="7596C8B8" id="Straight Connector 6" o:spid="_x0000_s1026" style="position:absolute;z-index:251659264;visibility:visible;mso-wrap-style:square;mso-wrap-distance-left:9pt;mso-wrap-distance-top:0;mso-wrap-distance-right:9pt;mso-wrap-distance-bottom:0;mso-position-horizontal:absolute;mso-position-horizontal-relative:text;mso-position-vertical:absolute;mso-position-vertical-relative:text" from="1pt,122.1pt" to="1pt,146.2pt" o:gfxdata="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" strokecolor="black [3213]">
                 <v:stroke joinstyle="miter"/>
               </v:line>
             </w:pict>
@@ -4846,70 +3762,14 @@
         <w:lastRenderedPageBreak/>
         <w:t>М</w:t>
       </w:r>
-      <w:proofErr w:type="spellStart"/>
       <w:r>
         <w:rPr>
           <w:rFonts w:ascii="Times New Roman" w:hAnsi="Times New Roman"/>
           <w:sz w:val="28"/>
           <w:szCs w:val="28"/>
         </w:rPr>
-        <w:t>атрицу</w:t>
-      </w:r>
-      <w:proofErr w:type="spellEnd"/>
-      <w:r>
-        <w:rPr>
-          <w:rFonts w:ascii="Times New Roman" w:hAnsi="Times New Roman"/>
-          <w:sz w:val="28"/>
-          <w:szCs w:val="28"/>
-        </w:rPr>
-        <w:t xml:space="preserve"> </w:t>
-      </w:r>
-      <w:proofErr w:type="spellStart"/>
-      <w:r>
-        <w:rPr>
-          <w:rFonts w:ascii="Times New Roman" w:hAnsi="Times New Roman"/>
-          <w:sz w:val="28"/>
-          <w:szCs w:val="28"/>
-        </w:rPr>
-        <w:t>рисков</w:t>
-      </w:r>
-      <w:proofErr w:type="spellEnd"/>
-      <w:r>
-        <w:rPr>
-          <w:rFonts w:ascii="Times New Roman" w:hAnsi="Times New Roman"/>
-          <w:sz w:val="28"/>
-          <w:szCs w:val="28"/>
-        </w:rPr>
-        <w:t xml:space="preserve"> </w:t>
-      </w:r>
-      <w:proofErr w:type="spellStart"/>
-      <w:r>
-        <w:rPr>
-          <w:rFonts w:ascii="Times New Roman" w:hAnsi="Times New Roman"/>
-          <w:sz w:val="28"/>
-          <w:szCs w:val="28"/>
-        </w:rPr>
-        <w:t>для</w:t>
-      </w:r>
-      <w:proofErr w:type="spellEnd"/>
-      <w:r>
-        <w:rPr>
-          <w:rFonts w:ascii="Times New Roman" w:hAnsi="Times New Roman"/>
-          <w:sz w:val="28"/>
-          <w:szCs w:val="28"/>
-        </w:rPr>
-        <w:t xml:space="preserve"> </w:t>
-      </w:r>
-      <w:proofErr w:type="spellStart"/>
-      <w:r>
-        <w:rPr>
-          <w:rFonts w:ascii="Times New Roman" w:hAnsi="Times New Roman"/>
-          <w:sz w:val="28"/>
-          <w:szCs w:val="28"/>
-        </w:rPr>
-        <w:t>данных</w:t>
-      </w:r>
-      <w:proofErr w:type="spellEnd"/>
+        <w:t>атрицу рисков для данных</w:t>
+      </w:r>
     </w:p>
     <w:p>
       <w:pPr>
@@ -5966,7 +4826,6 @@
           <w:szCs w:val="28"/>
         </w:rPr>
       </w:pPr>
-      <w:proofErr w:type="spellStart"/>
       <w:r>
         <w:rPr>
           <w:rFonts w:ascii="Times New Roman" w:hAnsi="Times New Roman"/>
@@ -5974,52 +4833,7 @@
           <w:szCs w:val="28"/>
         </w:rPr>
         <w:lastRenderedPageBreak/>
-        <w:t>Разработка</w:t>
-      </w:r>
-      <w:proofErr w:type="spellEnd"/>
-      <w:r>
-        <w:rPr>
-          <w:rFonts w:ascii="Times New Roman" w:hAnsi="Times New Roman"/>
-          <w:sz w:val="28"/>
-          <w:szCs w:val="28"/>
-        </w:rPr>
-        <w:t xml:space="preserve"> </w:t>
-      </w:r>
-      <w:proofErr w:type="spellStart"/>
-      <w:r>
-        <w:rPr>
-          <w:rFonts w:ascii="Times New Roman" w:hAnsi="Times New Roman"/>
-          <w:sz w:val="28"/>
-          <w:szCs w:val="28"/>
-        </w:rPr>
-        <w:t>локальных</w:t>
-      </w:r>
-      <w:proofErr w:type="spellEnd"/>
-      <w:r>
-        <w:rPr>
-          <w:rFonts w:ascii="Times New Roman" w:hAnsi="Times New Roman"/>
-          <w:sz w:val="28"/>
-          <w:szCs w:val="28"/>
-        </w:rPr>
-        <w:t xml:space="preserve"> </w:t>
-      </w:r>
-      <w:proofErr w:type="spellStart"/>
-      <w:r>
-        <w:rPr>
-          <w:rFonts w:ascii="Times New Roman" w:hAnsi="Times New Roman"/>
-          <w:sz w:val="28"/>
-          <w:szCs w:val="28"/>
-        </w:rPr>
-        <w:t>актов</w:t>
-      </w:r>
-      <w:proofErr w:type="spellEnd"/>
-      <w:r>
-        <w:rPr>
-          <w:rFonts w:ascii="Times New Roman" w:hAnsi="Times New Roman"/>
-          <w:sz w:val="28"/>
-          <w:szCs w:val="28"/>
-        </w:rPr>
-        <w:t>.</w:t>
+        <w:t>Разработка локальных актов.</w:t>
       </w:r>
     </w:p>
     <w:p>
@@ -6038,52 +4852,14 @@
           <w:szCs w:val="28"/>
         </w:rPr>
       </w:pPr>
-      <w:proofErr w:type="spellStart"/>
       <w:r>
         <w:rPr>
           <w:rFonts w:ascii="Times New Roman" w:hAnsi="Times New Roman"/>
           <w:sz w:val="28"/>
           <w:szCs w:val="28"/>
         </w:rPr>
-        <w:t>Политика</w:t>
-      </w:r>
-      <w:proofErr w:type="spellEnd"/>
-      <w:r>
-        <w:rPr>
-          <w:rFonts w:ascii="Times New Roman" w:hAnsi="Times New Roman"/>
-          <w:sz w:val="28"/>
-          <w:szCs w:val="28"/>
-        </w:rPr>
-        <w:t xml:space="preserve"> </w:t>
-      </w:r>
-      <w:proofErr w:type="spellStart"/>
-      <w:r>
-        <w:rPr>
-          <w:rFonts w:ascii="Times New Roman" w:hAnsi="Times New Roman"/>
-          <w:sz w:val="28"/>
-          <w:szCs w:val="28"/>
-        </w:rPr>
-        <w:t>информационной</w:t>
-      </w:r>
-      <w:proofErr w:type="spellEnd"/>
-      <w:r>
-        <w:rPr>
-          <w:rFonts w:ascii="Times New Roman" w:hAnsi="Times New Roman"/>
-          <w:sz w:val="28"/>
-          <w:szCs w:val="28"/>
-        </w:rPr>
-        <w:t xml:space="preserve"> </w:t>
-      </w:r>
-      <w:proofErr w:type="spellStart"/>
-      <w:r>
-        <w:rPr>
-          <w:rFonts w:ascii="Times New Roman" w:hAnsi="Times New Roman"/>
-          <w:sz w:val="28"/>
-          <w:szCs w:val="28"/>
-        </w:rPr>
-        <w:t>безопасности</w:t>
-      </w:r>
-      <w:proofErr w:type="spellEnd"/>
+        <w:t>Политика информационной безопасности</w:t>
+      </w:r>
     </w:p>
     <w:p>
       <w:pPr>
@@ -6116,34 +4892,14 @@
           <w:szCs w:val="24"/>
         </w:rPr>
       </w:pPr>
-      <w:proofErr w:type="spellStart"/>
       <w:r>
         <w:rPr>
           <w:rFonts w:ascii="Times New Roman" w:hAnsi="Times New Roman" w:cs="Times New Roman"/>
           <w:sz w:val="24"/>
           <w:szCs w:val="24"/>
         </w:rPr>
-        <w:t>Руководитель</w:t>
-      </w:r>
-      <w:proofErr w:type="spellEnd"/>
-      <w:r>
-        <w:rPr>
-          <w:rFonts w:ascii="Times New Roman" w:hAnsi="Times New Roman" w:cs="Times New Roman"/>
-          <w:sz w:val="24"/>
-          <w:szCs w:val="24"/>
-        </w:rPr>
-        <w:t xml:space="preserve"> </w:t>
-      </w:r>
-      <w:proofErr w:type="spellStart"/>
-      <w:r>
-        <w:rPr>
-          <w:rFonts w:ascii="Times New Roman" w:hAnsi="Times New Roman" w:cs="Times New Roman"/>
-          <w:sz w:val="24"/>
-          <w:szCs w:val="24"/>
-        </w:rPr>
-        <w:t>проекта</w:t>
-      </w:r>
-      <w:proofErr w:type="spellEnd"/>
+        <w:t>Руководитель проекта</w:t>
+      </w:r>
     </w:p>
     <w:p>
       <w:pPr>
@@ -6730,27 +5486,7 @@
           <w:szCs w:val="24"/>
           <w:lang w:val="ru-RU"/>
         </w:rPr>
-        <w:t xml:space="preserve">контактные данные (телефон, </w:t>
-      </w:r>
-      <w:proofErr w:type="spellStart"/>
-      <w:r>
-        <w:rPr>
-          <w:rFonts w:ascii="Times New Roman" w:hAnsi="Times New Roman" w:cs="Times New Roman"/>
-          <w:sz w:val="24"/>
-          <w:szCs w:val="24"/>
-          <w:lang w:val="ru-RU"/>
-        </w:rPr>
-        <w:t>email</w:t>
-      </w:r>
-      <w:proofErr w:type="spellEnd"/>
-      <w:r>
-        <w:rPr>
-          <w:rFonts w:ascii="Times New Roman" w:hAnsi="Times New Roman" w:cs="Times New Roman"/>
-          <w:sz w:val="24"/>
-          <w:szCs w:val="24"/>
-          <w:lang w:val="ru-RU"/>
-        </w:rPr>
-        <w:t>);</w:t>
+        <w:t>контактные данные (телефон, email);</w:t>
       </w:r>
       <w:r>
         <w:rPr>
@@ -7133,27 +5869,7 @@
           <w:szCs w:val="24"/>
           <w:lang w:val="ru-RU"/>
         </w:rPr>
-        <w:t xml:space="preserve">запрет вывода </w:t>
-      </w:r>
-      <w:proofErr w:type="spellStart"/>
-      <w:r>
-        <w:rPr>
-          <w:rFonts w:ascii="Times New Roman" w:hAnsi="Times New Roman" w:cs="Times New Roman"/>
-          <w:sz w:val="24"/>
-          <w:szCs w:val="24"/>
-          <w:lang w:val="ru-RU"/>
-        </w:rPr>
-        <w:t>ПДн</w:t>
-      </w:r>
-      <w:proofErr w:type="spellEnd"/>
-      <w:r>
-        <w:rPr>
-          <w:rFonts w:ascii="Times New Roman" w:hAnsi="Times New Roman" w:cs="Times New Roman"/>
-          <w:sz w:val="24"/>
-          <w:szCs w:val="24"/>
-          <w:lang w:val="ru-RU"/>
-        </w:rPr>
-        <w:t xml:space="preserve"> в журналы логирования;</w:t>
+        <w:t>запрет вывода ПДн в журналы логирования;</w:t>
       </w:r>
     </w:p>
     <w:p>
@@ -7231,27 +5947,7 @@
           <w:szCs w:val="24"/>
           <w:lang w:val="ru-RU"/>
         </w:rPr>
-        <w:t>хранение в защищённых конфигурационных файлах (.</w:t>
-      </w:r>
-      <w:proofErr w:type="spellStart"/>
-      <w:r>
-        <w:rPr>
-          <w:rFonts w:ascii="Times New Roman" w:hAnsi="Times New Roman" w:cs="Times New Roman"/>
-          <w:sz w:val="24"/>
-          <w:szCs w:val="24"/>
-          <w:lang w:val="ru-RU"/>
-        </w:rPr>
-        <w:t>env</w:t>
-      </w:r>
-      <w:proofErr w:type="spellEnd"/>
-      <w:r>
-        <w:rPr>
-          <w:rFonts w:ascii="Times New Roman" w:hAnsi="Times New Roman" w:cs="Times New Roman"/>
-          <w:sz w:val="24"/>
-          <w:szCs w:val="24"/>
-          <w:lang w:val="ru-RU"/>
-        </w:rPr>
-        <w:t>);</w:t>
+        <w:t>хранение в защищённых конфигурационных файлах (.env);</w:t>
       </w:r>
     </w:p>
     <w:p>
@@ -7494,27 +6190,7 @@
           <w:szCs w:val="24"/>
           <w:lang w:val="ru-RU"/>
         </w:rPr>
-        <w:t xml:space="preserve">соблюдать принципы Secure </w:t>
-      </w:r>
-      <w:proofErr w:type="spellStart"/>
-      <w:r>
-        <w:rPr>
-          <w:rFonts w:ascii="Times New Roman" w:hAnsi="Times New Roman" w:cs="Times New Roman"/>
-          <w:sz w:val="24"/>
-          <w:szCs w:val="24"/>
-          <w:lang w:val="ru-RU"/>
-        </w:rPr>
-        <w:t>Coding</w:t>
-      </w:r>
-      <w:proofErr w:type="spellEnd"/>
-      <w:r>
-        <w:rPr>
-          <w:rFonts w:ascii="Times New Roman" w:hAnsi="Times New Roman" w:cs="Times New Roman"/>
-          <w:sz w:val="24"/>
-          <w:szCs w:val="24"/>
-          <w:lang w:val="ru-RU"/>
-        </w:rPr>
-        <w:t>;</w:t>
+        <w:t>соблюдать принципы Secure Coding;</w:t>
       </w:r>
     </w:p>
     <w:p>
@@ -8302,7 +6978,6 @@
         </w:rPr>
         <w:t xml:space="preserve"> </w:t>
       </w:r>
-      <w:proofErr w:type="gramStart"/>
       <w:r>
         <w:rPr>
           <w:rFonts w:ascii="Times New Roman" w:hAnsi="Times New Roman" w:cs="Times New Roman"/>
@@ -8320,7 +6995,6 @@
         </w:rPr>
         <w:t>;</w:t>
       </w:r>
-      <w:proofErr w:type="gramEnd"/>
     </w:p>
     <w:p>
       <w:pPr>
@@ -9031,27 +7705,7 @@
           <w:szCs w:val="24"/>
           <w:lang w:val="ru-RU"/>
         </w:rPr>
-        <w:t xml:space="preserve">все операции с таблицами, содержащими </w:t>
-      </w:r>
-      <w:proofErr w:type="spellStart"/>
-      <w:r>
-        <w:rPr>
-          <w:rFonts w:ascii="Times New Roman" w:hAnsi="Times New Roman" w:cs="Times New Roman"/>
-          <w:sz w:val="24"/>
-          <w:szCs w:val="24"/>
-          <w:lang w:val="ru-RU"/>
-        </w:rPr>
-        <w:t>ПДн</w:t>
-      </w:r>
-      <w:proofErr w:type="spellEnd"/>
-      <w:r>
-        <w:rPr>
-          <w:rFonts w:ascii="Times New Roman" w:hAnsi="Times New Roman" w:cs="Times New Roman"/>
-          <w:sz w:val="24"/>
-          <w:szCs w:val="24"/>
-          <w:lang w:val="ru-RU"/>
-        </w:rPr>
-        <w:t>;</w:t>
+        <w:t>все операции с таблицами, содержащими ПДн;</w:t>
       </w:r>
     </w:p>
     <w:p>
@@ -9585,61 +8239,7 @@
           <w:sz w:val="24"/>
           <w:szCs w:val="24"/>
         </w:rPr>
-        <w:t xml:space="preserve">: </w:t>
-      </w:r>
-      <w:proofErr w:type="spellStart"/>
-      <w:r>
-        <w:rPr>
-          <w:rFonts w:ascii="Times New Roman" w:hAnsi="Times New Roman" w:cs="Times New Roman"/>
-          <w:sz w:val="24"/>
-          <w:szCs w:val="24"/>
-        </w:rPr>
-        <w:t>snake_case</w:t>
-      </w:r>
-      <w:proofErr w:type="spellEnd"/>
-      <w:r>
-        <w:rPr>
-          <w:rFonts w:ascii="Times New Roman" w:hAnsi="Times New Roman" w:cs="Times New Roman"/>
-          <w:sz w:val="24"/>
-          <w:szCs w:val="24"/>
-        </w:rPr>
-        <w:t xml:space="preserve"> (</w:t>
-      </w:r>
-      <w:proofErr w:type="spellStart"/>
-      <w:r>
-        <w:rPr>
-          <w:rFonts w:ascii="Times New Roman" w:hAnsi="Times New Roman" w:cs="Times New Roman"/>
-          <w:sz w:val="24"/>
-          <w:szCs w:val="24"/>
-        </w:rPr>
-        <w:t>created_at</w:t>
-      </w:r>
-      <w:proofErr w:type="spellEnd"/>
-      <w:r>
-        <w:rPr>
-          <w:rFonts w:ascii="Times New Roman" w:hAnsi="Times New Roman" w:cs="Times New Roman"/>
-          <w:sz w:val="24"/>
-          <w:szCs w:val="24"/>
-        </w:rPr>
-        <w:t xml:space="preserve">, </w:t>
-      </w:r>
-      <w:proofErr w:type="spellStart"/>
-      <w:r>
-        <w:rPr>
-          <w:rFonts w:ascii="Times New Roman" w:hAnsi="Times New Roman" w:cs="Times New Roman"/>
-          <w:sz w:val="24"/>
-          <w:szCs w:val="24"/>
-        </w:rPr>
-        <w:t>task_status</w:t>
-      </w:r>
-      <w:proofErr w:type="spellEnd"/>
-      <w:r>
-        <w:rPr>
-          <w:rFonts w:ascii="Times New Roman" w:hAnsi="Times New Roman" w:cs="Times New Roman"/>
-          <w:sz w:val="24"/>
-          <w:szCs w:val="24"/>
-        </w:rPr>
-        <w:t>);</w:t>
+        <w:t>: snake_case (created_at, task_status);</w:t>
       </w:r>
     </w:p>
     <w:p>
@@ -9701,51 +8301,7 @@
           <w:sz w:val="24"/>
           <w:szCs w:val="24"/>
         </w:rPr>
-        <w:t>id (</w:t>
-      </w:r>
-      <w:proofErr w:type="spellStart"/>
-      <w:r>
-        <w:rPr>
-          <w:rFonts w:ascii="Times New Roman" w:hAnsi="Times New Roman" w:cs="Times New Roman"/>
-          <w:i/>
-          <w:iCs/>
-          <w:sz w:val="24"/>
-          <w:szCs w:val="24"/>
-        </w:rPr>
-        <w:t>user_id</w:t>
-      </w:r>
-      <w:proofErr w:type="spellEnd"/>
-      <w:r>
-        <w:rPr>
-          <w:rFonts w:ascii="Times New Roman" w:hAnsi="Times New Roman" w:cs="Times New Roman"/>
-          <w:i/>
-          <w:iCs/>
-          <w:sz w:val="24"/>
-          <w:szCs w:val="24"/>
-        </w:rPr>
-        <w:t xml:space="preserve">, </w:t>
-      </w:r>
-      <w:proofErr w:type="spellStart"/>
-      <w:r>
-        <w:rPr>
-          <w:rFonts w:ascii="Times New Roman" w:hAnsi="Times New Roman" w:cs="Times New Roman"/>
-          <w:i/>
-          <w:iCs/>
-          <w:sz w:val="24"/>
-          <w:szCs w:val="24"/>
-        </w:rPr>
-        <w:t>task_id</w:t>
-      </w:r>
-      <w:proofErr w:type="spellEnd"/>
-      <w:r>
-        <w:rPr>
-          <w:rFonts w:ascii="Times New Roman" w:hAnsi="Times New Roman" w:cs="Times New Roman"/>
-          <w:i/>
-          <w:iCs/>
-          <w:sz w:val="24"/>
-          <w:szCs w:val="24"/>
-        </w:rPr>
-        <w:t>);</w:t>
+        <w:t>id (user_id, task_id);</w:t>
       </w:r>
     </w:p>
     <w:p>
@@ -9775,9 +8331,17 @@
           <w:szCs w:val="24"/>
           <w:lang w:val="ru-RU"/>
         </w:rPr>
-        <w:t xml:space="preserve">индексы: </w:t>
-      </w:r>
-      <w:proofErr w:type="spellStart"/>
+        <w:t>индексы: idx</w:t>
+      </w:r>
+      <w:r>
+        <w:rPr>
+          <w:rFonts w:ascii="Times New Roman" w:hAnsi="Times New Roman" w:cs="Times New Roman"/>
+          <w:sz w:val="24"/>
+          <w:szCs w:val="24"/>
+          <w:lang w:val="ru-RU"/>
+        </w:rPr>
+        <w:t>{table}</w:t>
+      </w:r>
       <w:r>
         <w:rPr>
           <w:rFonts w:ascii="Times New Roman" w:hAnsi="Times New Roman" w:cs="Times New Roman"/>
@@ -9787,72 +8351,7 @@
           <w:szCs w:val="24"/>
           <w:lang w:val="ru-RU"/>
         </w:rPr>
-        <w:t>idx</w:t>
-      </w:r>
-      <w:proofErr w:type="spellEnd"/>
-      <w:r>
-        <w:rPr>
-          <w:rFonts w:ascii="Times New Roman" w:hAnsi="Times New Roman" w:cs="Times New Roman"/>
-          <w:sz w:val="24"/>
-          <w:szCs w:val="24"/>
-          <w:lang w:val="ru-RU"/>
-        </w:rPr>
-        <w:t>{</w:t>
-      </w:r>
-      <w:proofErr w:type="spellStart"/>
-      <w:r>
-        <w:rPr>
-          <w:rFonts w:ascii="Times New Roman" w:hAnsi="Times New Roman" w:cs="Times New Roman"/>
-          <w:sz w:val="24"/>
-          <w:szCs w:val="24"/>
-          <w:lang w:val="ru-RU"/>
-        </w:rPr>
-        <w:t>table</w:t>
-      </w:r>
-      <w:proofErr w:type="spellEnd"/>
-      <w:r>
-        <w:rPr>
-          <w:rFonts w:ascii="Times New Roman" w:hAnsi="Times New Roman" w:cs="Times New Roman"/>
-          <w:sz w:val="24"/>
-          <w:szCs w:val="24"/>
-          <w:lang w:val="ru-RU"/>
-        </w:rPr>
-        <w:t>}</w:t>
-      </w:r>
-      <w:r>
-        <w:rPr>
-          <w:rFonts w:ascii="Times New Roman" w:hAnsi="Times New Roman" w:cs="Times New Roman"/>
-          <w:i/>
-          <w:iCs/>
-          <w:sz w:val="24"/>
-          <w:szCs w:val="24"/>
-          <w:lang w:val="ru-RU"/>
-        </w:rPr>
-        <w:t>{</w:t>
-      </w:r>
-      <w:proofErr w:type="spellStart"/>
-      <w:r>
-        <w:rPr>
-          <w:rFonts w:ascii="Times New Roman" w:hAnsi="Times New Roman" w:cs="Times New Roman"/>
-          <w:i/>
-          <w:iCs/>
-          <w:sz w:val="24"/>
-          <w:szCs w:val="24"/>
-          <w:lang w:val="ru-RU"/>
-        </w:rPr>
-        <w:t>field</w:t>
-      </w:r>
-      <w:proofErr w:type="spellEnd"/>
-      <w:r>
-        <w:rPr>
-          <w:rFonts w:ascii="Times New Roman" w:hAnsi="Times New Roman" w:cs="Times New Roman"/>
-          <w:i/>
-          <w:iCs/>
-          <w:sz w:val="24"/>
-          <w:szCs w:val="24"/>
-          <w:lang w:val="ru-RU"/>
-        </w:rPr>
-        <w:t>};</w:t>
+        <w:t>{field};</w:t>
       </w:r>
     </w:p>
     <w:p>
@@ -9880,69 +8379,16 @@
           <w:szCs w:val="24"/>
           <w:lang w:val="ru-RU"/>
         </w:rPr>
-        <w:t xml:space="preserve">уникальные ограничения: </w:t>
-      </w:r>
-      <w:proofErr w:type="spellStart"/>
-      <w:r>
-        <w:rPr>
-          <w:rFonts w:ascii="Times New Roman" w:hAnsi="Times New Roman" w:cs="Times New Roman"/>
-          <w:i/>
-          <w:iCs/>
+        <w:t>уникальные ограничения: unq</w:t>
+      </w:r>
+      <w:r>
+        <w:rPr>
+          <w:rFonts w:ascii="Times New Roman" w:hAnsi="Times New Roman" w:cs="Times New Roman"/>
           <w:sz w:val="24"/>
           <w:szCs w:val="24"/>
           <w:lang w:val="ru-RU"/>
         </w:rPr>
-        <w:t>unq</w:t>
-      </w:r>
-      <w:proofErr w:type="spellEnd"/>
-      <w:r>
-        <w:rPr>
-          <w:rFonts w:ascii="Times New Roman" w:hAnsi="Times New Roman" w:cs="Times New Roman"/>
-          <w:sz w:val="24"/>
-          <w:szCs w:val="24"/>
-          <w:lang w:val="ru-RU"/>
-        </w:rPr>
-        <w:t>{</w:t>
-      </w:r>
-      <w:proofErr w:type="spellStart"/>
-      <w:r>
-        <w:rPr>
-          <w:rFonts w:ascii="Times New Roman" w:hAnsi="Times New Roman" w:cs="Times New Roman"/>
-          <w:sz w:val="24"/>
-          <w:szCs w:val="24"/>
-          <w:lang w:val="ru-RU"/>
-        </w:rPr>
-        <w:t>table</w:t>
-      </w:r>
-      <w:proofErr w:type="spellEnd"/>
-      <w:r>
-        <w:rPr>
-          <w:rFonts w:ascii="Times New Roman" w:hAnsi="Times New Roman" w:cs="Times New Roman"/>
-          <w:sz w:val="24"/>
-          <w:szCs w:val="24"/>
-          <w:lang w:val="ru-RU"/>
-        </w:rPr>
-        <w:t>}_{</w:t>
-      </w:r>
-      <w:proofErr w:type="spellStart"/>
-      <w:r>
-        <w:rPr>
-          <w:rFonts w:ascii="Times New Roman" w:hAnsi="Times New Roman" w:cs="Times New Roman"/>
-          <w:sz w:val="24"/>
-          <w:szCs w:val="24"/>
-          <w:lang w:val="ru-RU"/>
-        </w:rPr>
-        <w:t>field</w:t>
-      </w:r>
-      <w:proofErr w:type="spellEnd"/>
-      <w:r>
-        <w:rPr>
-          <w:rFonts w:ascii="Times New Roman" w:hAnsi="Times New Roman" w:cs="Times New Roman"/>
-          <w:sz w:val="24"/>
-          <w:szCs w:val="24"/>
-          <w:lang w:val="ru-RU"/>
-        </w:rPr>
-        <w:t>}.</w:t>
+        <w:t>{table}_{field}.</w:t>
       </w:r>
     </w:p>
     <w:p>
@@ -10493,49 +8939,7 @@
           <w:szCs w:val="24"/>
           <w:lang w:val="ru-RU"/>
         </w:rPr>
-        <w:t xml:space="preserve">тестирование на тестовой </w:t>
-      </w:r>
-      <w:proofErr w:type="spellStart"/>
-      <w:proofErr w:type="gramStart"/>
-      <w:r>
-        <w:rPr>
-          <w:rFonts w:ascii="Times New Roman" w:hAnsi="Times New Roman" w:cs="Times New Roman"/>
-          <w:sz w:val="24"/>
-          <w:szCs w:val="24"/>
-          <w:lang w:val="ru-RU"/>
-        </w:rPr>
-        <w:t>БД;подготовка</w:t>
-      </w:r>
-      <w:proofErr w:type="spellEnd"/>
-      <w:proofErr w:type="gramEnd"/>
-      <w:r>
-        <w:rPr>
-          <w:rFonts w:ascii="Times New Roman" w:hAnsi="Times New Roman" w:cs="Times New Roman"/>
-          <w:sz w:val="24"/>
-          <w:szCs w:val="24"/>
-          <w:lang w:val="ru-RU"/>
-        </w:rPr>
-        <w:t xml:space="preserve"> </w:t>
-      </w:r>
-      <w:proofErr w:type="spellStart"/>
-      <w:r>
-        <w:rPr>
-          <w:rFonts w:ascii="Times New Roman" w:hAnsi="Times New Roman" w:cs="Times New Roman"/>
-          <w:sz w:val="24"/>
-          <w:szCs w:val="24"/>
-          <w:lang w:val="ru-RU"/>
-        </w:rPr>
-        <w:t>rollback</w:t>
-      </w:r>
-      <w:proofErr w:type="spellEnd"/>
-      <w:r>
-        <w:rPr>
-          <w:rFonts w:ascii="Times New Roman" w:hAnsi="Times New Roman" w:cs="Times New Roman"/>
-          <w:sz w:val="24"/>
-          <w:szCs w:val="24"/>
-          <w:lang w:val="ru-RU"/>
-        </w:rPr>
-        <w:t>-скрипта.</w:t>
+        <w:t>тестирование на тестовой БД;подготовка rollback-скрипта.</w:t>
       </w:r>
     </w:p>
     <w:p>
@@ -10774,27 +9178,7 @@
           <w:lang w:val="ru-RU"/>
         </w:rPr>
         <w:lastRenderedPageBreak/>
-        <w:t xml:space="preserve">Планирование работ. Построение диаграммы </w:t>
-      </w:r>
-      <w:proofErr w:type="spellStart"/>
-      <w:r>
-        <w:rPr>
-          <w:rFonts w:ascii="Times New Roman" w:hAnsi="Times New Roman"/>
-          <w:sz w:val="28"/>
-          <w:szCs w:val="28"/>
-          <w:lang w:val="ru-RU"/>
-        </w:rPr>
-        <w:t>Ганта</w:t>
-      </w:r>
-      <w:proofErr w:type="spellEnd"/>
-      <w:r>
-        <w:rPr>
-          <w:rFonts w:ascii="Times New Roman" w:hAnsi="Times New Roman"/>
-          <w:sz w:val="28"/>
-          <w:szCs w:val="28"/>
-          <w:lang w:val="ru-RU"/>
-        </w:rPr>
-        <w:t xml:space="preserve"> для планирования работ по проекту</w:t>
+        <w:t>Планирование работ. Построение диаграммы Ганта для планирования работ по проекту</w:t>
       </w:r>
     </w:p>
     <w:p>
@@ -12288,22 +10672,8 @@
                 <w:shd w:val="clear" w:color="auto" w:fill="FFFFFF"/>
                 <w:lang w:val="ru-RU"/>
               </w:rPr>
-              <w:t xml:space="preserve">Диаграмма </w:t>
+              <w:t>Диаграмма Ганта</w:t>
             </w:r>
-            <w:proofErr w:type="spellStart"/>
-            <w:r>
-              <w:rPr>
-                <w:rFonts w:ascii="Times New Roman" w:hAnsi="Times New Roman" w:cs="Times New Roman"/>
-                <w:color w:val="000000"/>
-                <w:kern w:val="2"/>
-                <w:sz w:val="24"/>
-                <w:szCs w:val="24"/>
-                <w:shd w:val="clear" w:color="auto" w:fill="FFFFFF"/>
-                <w:lang w:val="ru-RU"/>
-              </w:rPr>
-              <w:t>Ганта</w:t>
-            </w:r>
-            <w:proofErr w:type="spellEnd"/>
           </w:p>
         </w:tc>
         <w:tc>
@@ -12637,7 +11007,6 @@
                 <w:lang w:val="ru-RU"/>
               </w:rPr>
             </w:pPr>
-            <w:proofErr w:type="spellStart"/>
             <w:r>
               <w:rPr>
                 <w:rFonts w:ascii="Times New Roman" w:hAnsi="Times New Roman" w:cs="Times New Roman"/>
@@ -12650,7 +11019,6 @@
               </w:rPr>
               <w:t>PostgreSQL</w:t>
             </w:r>
-            <w:proofErr w:type="spellEnd"/>
           </w:p>
         </w:tc>
         <w:tc>
@@ -12806,22 +11174,8 @@
                 <w:shd w:val="clear" w:color="auto" w:fill="FFFFFF"/>
                 <w:lang w:val="ru-RU"/>
               </w:rPr>
-              <w:t xml:space="preserve">VMware / </w:t>
+              <w:t>VMware / VirtualBox</w:t>
             </w:r>
-            <w:proofErr w:type="spellStart"/>
-            <w:r>
-              <w:rPr>
-                <w:rFonts w:ascii="Times New Roman" w:hAnsi="Times New Roman" w:cs="Times New Roman"/>
-                <w:color w:val="000000"/>
-                <w:kern w:val="2"/>
-                <w:sz w:val="24"/>
-                <w:szCs w:val="24"/>
-                <w:shd w:val="clear" w:color="auto" w:fill="FFFFFF"/>
-                <w:lang w:val="ru-RU"/>
-              </w:rPr>
-              <w:t>VirtualBox</w:t>
-            </w:r>
-            <w:proofErr w:type="spellEnd"/>
           </w:p>
         </w:tc>
         <w:tc>
@@ -12968,7 +11322,6 @@
                 <w:lang w:val="ru-RU"/>
               </w:rPr>
             </w:pPr>
-            <w:proofErr w:type="spellStart"/>
             <w:r>
               <w:rPr>
                 <w:rFonts w:ascii="Times New Roman" w:hAnsi="Times New Roman" w:cs="Times New Roman"/>
@@ -12981,7 +11334,6 @@
               </w:rPr>
               <w:t>Git</w:t>
             </w:r>
-            <w:proofErr w:type="spellEnd"/>
           </w:p>
         </w:tc>
         <w:tc>
@@ -13032,7 +11384,6 @@
                 <w:lang w:val="ru-RU"/>
               </w:rPr>
             </w:pPr>
-            <w:proofErr w:type="spellStart"/>
             <w:r>
               <w:rPr>
                 <w:rFonts w:ascii="Times New Roman" w:hAnsi="Times New Roman" w:cs="Times New Roman"/>
@@ -13045,7 +11396,6 @@
               </w:rPr>
               <w:t>Git</w:t>
             </w:r>
-            <w:proofErr w:type="spellEnd"/>
           </w:p>
         </w:tc>
         <w:tc>
@@ -13362,33 +11712,7 @@
           <w:shd w:val="clear" w:color="auto" w:fill="FFFFFF"/>
           <w:lang w:val="ru-RU"/>
         </w:rPr>
-        <w:t>Для реализации системы выбрана трёхуровневая архитектура (n-</w:t>
-      </w:r>
-      <w:proofErr w:type="spellStart"/>
-      <w:r>
-        <w:rPr>
-          <w:rFonts w:ascii="Times New Roman" w:hAnsi="Times New Roman" w:cs="Times New Roman"/>
-          <w:color w:val="000000"/>
-          <w:kern w:val="2"/>
-          <w:sz w:val="28"/>
-          <w:szCs w:val="28"/>
-          <w:shd w:val="clear" w:color="auto" w:fill="FFFFFF"/>
-          <w:lang w:val="ru-RU"/>
-        </w:rPr>
-        <w:t>tier</w:t>
-      </w:r>
-      <w:proofErr w:type="spellEnd"/>
-      <w:r>
-        <w:rPr>
-          <w:rFonts w:ascii="Times New Roman" w:hAnsi="Times New Roman" w:cs="Times New Roman"/>
-          <w:color w:val="000000"/>
-          <w:kern w:val="2"/>
-          <w:sz w:val="28"/>
-          <w:szCs w:val="28"/>
-          <w:shd w:val="clear" w:color="auto" w:fill="FFFFFF"/>
-          <w:lang w:val="ru-RU"/>
-        </w:rPr>
-        <w:t>). Такой подход предполагает разделение программного комплекса на несколько логически независимых уровней. Благодаря этому упрощается сопровождение системы, повышается её масштабируемость и обеспечивается более высокий уровень безопасности.</w:t>
+        <w:t>Для реализации системы выбрана трёхуровневая архитектура (n-tier). Такой подход предполагает разделение программного комплекса на несколько логически независимых уровней. Благодаря этому упрощается сопровождение системы, повышается её масштабируемость и обеспечивается более высокий уровень безопасности.</w:t>
       </w:r>
     </w:p>
     <w:p>
@@ -13967,33 +12291,7 @@
           <w:shd w:val="clear" w:color="auto" w:fill="FFFFFF"/>
           <w:lang w:val="ru-RU"/>
         </w:rPr>
-        <w:t xml:space="preserve">В качестве системы управления базами данных используется </w:t>
-      </w:r>
-      <w:proofErr w:type="spellStart"/>
-      <w:r>
-        <w:rPr>
-          <w:rFonts w:ascii="Times New Roman" w:hAnsi="Times New Roman" w:cs="Times New Roman"/>
-          <w:color w:val="000000"/>
-          <w:kern w:val="2"/>
-          <w:sz w:val="28"/>
-          <w:szCs w:val="28"/>
-          <w:shd w:val="clear" w:color="auto" w:fill="FFFFFF"/>
-          <w:lang w:val="ru-RU"/>
-        </w:rPr>
-        <w:t>PostgreSQL</w:t>
-      </w:r>
-      <w:proofErr w:type="spellEnd"/>
-      <w:r>
-        <w:rPr>
-          <w:rFonts w:ascii="Times New Roman" w:hAnsi="Times New Roman" w:cs="Times New Roman"/>
-          <w:color w:val="000000"/>
-          <w:kern w:val="2"/>
-          <w:sz w:val="28"/>
-          <w:szCs w:val="28"/>
-          <w:shd w:val="clear" w:color="auto" w:fill="FFFFFF"/>
-          <w:lang w:val="ru-RU"/>
-        </w:rPr>
-        <w:t>. В базе данных хранятся основные сущности системы. К ним относятся пользователи системы, роли пользователей, поручения, статусы выполнения задач, комментарии пользователей, отчёты и журнал аудита действий.</w:t>
+        <w:t>В качестве системы управления базами данных используется PostgreSQL. В базе данных хранятся основные сущности системы. К ним относятся пользователи системы, роли пользователей, поручения, статусы выполнения задач, комментарии пользователей, отчёты и журнал аудита действий.</w:t>
       </w:r>
     </w:p>
     <w:p>
@@ -14445,10 +12743,16 @@
           <w:lang w:bidi="ar"/>
         </w:rPr>
         <w:drawing>
-          <wp:inline distT="0" distB="0" distL="0" distR="0" wp14:anchorId="05EA0501" wp14:editId="016C4885">
-            <wp:extent cx="5934710" cy="6970395"/>
-            <wp:effectExtent l="0" t="0" r="8890" b="1905"/>
-            <wp:docPr id="1186668152" name="Рисунок 2"/>
+          <wp:inline distT="0" distB="0" distL="0" distR="0" wp14:anchorId="6A2D9CC6" wp14:editId="07ABA669">
+            <wp:extent cx="5940425" cy="3133725"/>
+            <wp:effectExtent l="0" t="0" r="3175" b="9525"/>
+            <wp:docPr id="4" name="Рисунок 3">
+              <a:extLst xmlns:a="http://schemas.openxmlformats.org/drawingml/2006/main">
+                <a:ext uri="{FF2B5EF4-FFF2-40B4-BE49-F238E27FC236}">
+                  <a16:creationId xmlns:a16="http://schemas.microsoft.com/office/drawing/2014/main" id="{323C2448-E801-9BAE-92F7-6504F206370E}"/>
+                </a:ext>
+              </a:extLst>
+            </wp:docPr>
             <wp:cNvGraphicFramePr>
               <a:graphicFrameLocks xmlns:a="http://schemas.openxmlformats.org/drawingml/2006/main" noChangeAspect="1"/>
             </wp:cNvGraphicFramePr>
@@ -14456,187 +12760,19 @@
               <a:graphicData uri="http://schemas.openxmlformats.org/drawingml/2006/picture">
                 <pic:pic xmlns:pic="http://schemas.openxmlformats.org/drawingml/2006/picture">
                   <pic:nvPicPr>
-                    <pic:cNvPr id="0" name="Picture 290"/>
+                    <pic:cNvPr id="4" name="Рисунок 3">
+                      <a:extLst>
+                        <a:ext uri="{FF2B5EF4-FFF2-40B4-BE49-F238E27FC236}">
+                          <a16:creationId xmlns:a16="http://schemas.microsoft.com/office/drawing/2014/main" id="{323C2448-E801-9BAE-92F7-6504F206370E}"/>
+                        </a:ext>
+                      </a:extLst>
+                    </pic:cNvPr>
                     <pic:cNvPicPr>
-                      <a:picLocks noChangeAspect="1" noChangeArrowheads="1"/>
+                      <a:picLocks noChangeAspect="1"/>
                     </pic:cNvPicPr>
                   </pic:nvPicPr>
                   <pic:blipFill>
-                    <a:blip r:embed="rId12" cstate="print">
-                      <a:extLst>
-                        <a:ext uri="{28A0092B-C50C-407E-A947-70E740481C1C}">
-                          <a14:useLocalDpi xmlns:a14="http://schemas.microsoft.com/office/drawing/2010/main" val="0"/>
-                        </a:ext>
-                      </a:extLst>
-                    </a:blip>
-                    <a:srcRect/>
-                    <a:stretch>
-                      <a:fillRect/>
-                    </a:stretch>
-                  </pic:blipFill>
-                  <pic:spPr bwMode="auto">
-                    <a:xfrm>
-                      <a:off x="0" y="0"/>
-                      <a:ext cx="5934710" cy="6970395"/>
-                    </a:xfrm>
-                    <a:prstGeom prst="rect">
-                      <a:avLst/>
-                    </a:prstGeom>
-                    <a:noFill/>
-                    <a:ln>
-                      <a:noFill/>
-                    </a:ln>
-                  </pic:spPr>
-                </pic:pic>
-              </a:graphicData>
-            </a:graphic>
-          </wp:inline>
-        </w:drawing>
-      </w:r>
-    </w:p>
-    <w:p>
-      <w:pPr>
-        <w:pStyle w:val="1c"/>
-        <w:shd w:val="clear" w:color="auto" w:fill="FFFFFF"/>
-        <w:spacing w:beforeAutospacing="1" w:after="0" w:line="360" w:lineRule="auto"/>
-        <w:ind w:left="0"/>
-        <w:jc w:val="center"/>
-        <w:rPr>
-          <w:rFonts w:ascii="Times New Roman" w:hAnsi="Times New Roman"/>
-          <w:color w:val="000000"/>
-          <w:sz w:val="28"/>
-          <w:szCs w:val="28"/>
-          <w:shd w:val="clear" w:color="auto" w:fill="FFFFFF"/>
-        </w:rPr>
-      </w:pPr>
-      <w:r>
-        <w:rPr>
-          <w:rFonts w:ascii="Times New Roman" w:hAnsi="Times New Roman"/>
-          <w:color w:val="000000"/>
-          <w:sz w:val="28"/>
-          <w:szCs w:val="28"/>
-          <w:shd w:val="clear" w:color="auto" w:fill="FFFFFF"/>
-          <w:lang w:val="ru-RU" w:bidi="ar"/>
-        </w:rPr>
-        <w:t xml:space="preserve">Рисунок 3 </w:t>
-      </w:r>
-      <w:r>
-        <w:rPr>
-          <w:rFonts w:ascii="Times New Roman" w:hAnsi="Times New Roman"/>
-          <w:color w:val="000000"/>
-          <w:sz w:val="28"/>
-          <w:szCs w:val="28"/>
-          <w:shd w:val="clear" w:color="auto" w:fill="FFFFFF"/>
-        </w:rPr>
-        <w:t>–</w:t>
-      </w:r>
-      <w:r>
-        <w:rPr>
-          <w:rFonts w:ascii="Times New Roman" w:hAnsi="Times New Roman"/>
-          <w:color w:val="000000"/>
-          <w:sz w:val="28"/>
-          <w:szCs w:val="28"/>
-          <w:shd w:val="clear" w:color="auto" w:fill="FFFFFF"/>
-          <w:lang w:val="ru-RU"/>
-        </w:rPr>
-        <w:t xml:space="preserve"> </w:t>
-      </w:r>
-      <w:r>
-        <w:rPr>
-          <w:rFonts w:ascii="Times New Roman" w:hAnsi="Times New Roman"/>
-          <w:color w:val="000000"/>
-          <w:sz w:val="28"/>
-          <w:szCs w:val="28"/>
-          <w:shd w:val="clear" w:color="auto" w:fill="FFFFFF"/>
-          <w:lang w:val="ru-RU" w:bidi="ar"/>
-        </w:rPr>
-        <w:t>Интеллектуальная карта проекта</w:t>
-      </w:r>
-    </w:p>
-    <w:p>
-      <w:pPr>
-        <w:pStyle w:val="1c"/>
-        <w:keepNext/>
-        <w:numPr>
-          <w:ilvl w:val="0"/>
-          <w:numId w:val="100"/>
-        </w:numPr>
-        <w:shd w:val="clear" w:color="auto" w:fill="FFFFFF"/>
-        <w:spacing w:before="100" w:beforeAutospacing="1" w:after="0" w:line="360" w:lineRule="auto"/>
-        <w:jc w:val="both"/>
-        <w:rPr>
-          <w:rFonts w:ascii="Times New Roman" w:hAnsi="Times New Roman"/>
-          <w:color w:val="000000"/>
-          <w:sz w:val="28"/>
-          <w:szCs w:val="28"/>
-          <w:shd w:val="clear" w:color="auto" w:fill="FFFFFF"/>
-        </w:rPr>
-      </w:pPr>
-      <w:r>
-        <w:rPr>
-          <w:rFonts w:ascii="Times New Roman" w:hAnsi="Times New Roman"/>
-          <w:color w:val="000000"/>
-          <w:sz w:val="28"/>
-          <w:szCs w:val="28"/>
-          <w:shd w:val="clear" w:color="auto" w:fill="FFFFFF"/>
-          <w:lang w:val="ru-RU"/>
-        </w:rPr>
-        <w:lastRenderedPageBreak/>
-        <w:t xml:space="preserve">Диаграмма </w:t>
-      </w:r>
-      <w:proofErr w:type="spellStart"/>
-      <w:r>
-        <w:rPr>
-          <w:rFonts w:ascii="Times New Roman" w:hAnsi="Times New Roman"/>
-          <w:color w:val="000000"/>
-          <w:sz w:val="28"/>
-          <w:szCs w:val="28"/>
-          <w:shd w:val="clear" w:color="auto" w:fill="FFFFFF"/>
-          <w:lang w:val="ru-RU"/>
-        </w:rPr>
-        <w:t>Ганта</w:t>
-      </w:r>
-      <w:proofErr w:type="spellEnd"/>
-    </w:p>
-    <w:p>
-      <w:pPr>
-        <w:keepNext/>
-        <w:spacing w:before="120" w:line="360" w:lineRule="auto"/>
-        <w:jc w:val="center"/>
-        <w:rPr>
-          <w:rFonts w:ascii="Times New Roman" w:eastAsia="Aptos" w:hAnsi="Times New Roman" w:cs="Times New Roman"/>
-          <w:kern w:val="2"/>
-          <w:sz w:val="28"/>
-          <w:szCs w:val="28"/>
-          <w:lang w:bidi="ar"/>
-        </w:rPr>
-      </w:pPr>
-      <w:r>
-        <w:rPr>
-          <w:rFonts w:ascii="Times New Roman" w:eastAsia="Aptos" w:hAnsi="Times New Roman" w:cs="Times New Roman"/>
-          <w:noProof/>
-          <w:kern w:val="2"/>
-          <w:sz w:val="28"/>
-          <w:szCs w:val="28"/>
-          <w:lang w:bidi="ar"/>
-        </w:rPr>
-        <w:drawing>
-          <wp:inline distT="0" distB="0" distL="0" distR="0" wp14:anchorId="666CA7FB" wp14:editId="152D36BF">
-            <wp:extent cx="5940425" cy="812800"/>
-            <wp:effectExtent l="0" t="0" r="3175" b="6350"/>
-            <wp:docPr id="1299795956" name="Рисунок 1" descr="Изображение выглядит как текст, линия, Шрифт, График&#10;&#10;Содержимое, созданное искусственным интеллектом, может быть неверным."/>
-            <wp:cNvGraphicFramePr>
-              <a:graphicFrameLocks xmlns:a="http://schemas.openxmlformats.org/drawingml/2006/main" noChangeAspect="1"/>
-            </wp:cNvGraphicFramePr>
-            <a:graphic xmlns:a="http://schemas.openxmlformats.org/drawingml/2006/main">
-              <a:graphicData uri="http://schemas.openxmlformats.org/drawingml/2006/picture">
-                <pic:pic xmlns:pic="http://schemas.openxmlformats.org/drawingml/2006/picture">
-                  <pic:nvPicPr>
-                    <pic:cNvPr id="1299795956" name="Рисунок 1" descr="Изображение выглядит как текст, линия, Шрифт, График&#10;&#10;Содержимое, созданное искусственным интеллектом, может быть неверным."/>
-                    <pic:cNvPicPr/>
-                  </pic:nvPicPr>
-                  <pic:blipFill>
-                    <a:blip r:embed="rId13"/>
+                    <a:blip r:embed="rId12"/>
                     <a:stretch>
                       <a:fillRect/>
                     </a:stretch>
@@ -14644,7 +12780,7 @@
                   <pic:spPr>
                     <a:xfrm>
                       <a:off x="0" y="0"/>
-                      <a:ext cx="5940425" cy="812800"/>
+                      <a:ext cx="5940425" cy="3133725"/>
                     </a:xfrm>
                     <a:prstGeom prst="rect">
                       <a:avLst/>
@@ -14659,15 +12795,180 @@
     </w:p>
     <w:p>
       <w:pPr>
+        <w:pStyle w:val="1c"/>
+        <w:shd w:val="clear" w:color="auto" w:fill="FFFFFF"/>
+        <w:spacing w:beforeAutospacing="1" w:after="0" w:line="360" w:lineRule="auto"/>
+        <w:ind w:left="0"/>
+        <w:jc w:val="center"/>
+        <w:rPr>
+          <w:rFonts w:ascii="Times New Roman" w:hAnsi="Times New Roman"/>
+          <w:color w:val="000000"/>
+          <w:sz w:val="28"/>
+          <w:szCs w:val="28"/>
+          <w:shd w:val="clear" w:color="auto" w:fill="FFFFFF"/>
+        </w:rPr>
+      </w:pPr>
+      <w:r>
+        <w:rPr>
+          <w:rFonts w:ascii="Times New Roman" w:hAnsi="Times New Roman"/>
+          <w:color w:val="000000"/>
+          <w:sz w:val="28"/>
+          <w:szCs w:val="28"/>
+          <w:shd w:val="clear" w:color="auto" w:fill="FFFFFF"/>
+          <w:lang w:val="ru-RU" w:bidi="ar"/>
+        </w:rPr>
+        <w:t xml:space="preserve">Рисунок 3 </w:t>
+      </w:r>
+      <w:r>
+        <w:rPr>
+          <w:rFonts w:ascii="Times New Roman" w:hAnsi="Times New Roman"/>
+          <w:color w:val="000000"/>
+          <w:sz w:val="28"/>
+          <w:szCs w:val="28"/>
+          <w:shd w:val="clear" w:color="auto" w:fill="FFFFFF"/>
+        </w:rPr>
+        <w:t>–</w:t>
+      </w:r>
+      <w:r>
+        <w:rPr>
+          <w:rFonts w:ascii="Times New Roman" w:hAnsi="Times New Roman"/>
+          <w:color w:val="000000"/>
+          <w:sz w:val="28"/>
+          <w:szCs w:val="28"/>
+          <w:shd w:val="clear" w:color="auto" w:fill="FFFFFF"/>
+          <w:lang w:val="ru-RU"/>
+        </w:rPr>
+        <w:t xml:space="preserve"> </w:t>
+      </w:r>
+      <w:r>
+        <w:rPr>
+          <w:rFonts w:ascii="Times New Roman" w:hAnsi="Times New Roman"/>
+          <w:color w:val="000000"/>
+          <w:sz w:val="28"/>
+          <w:szCs w:val="28"/>
+          <w:shd w:val="clear" w:color="auto" w:fill="FFFFFF"/>
+          <w:lang w:val="ru-RU" w:bidi="ar"/>
+        </w:rPr>
+        <w:t>Интеллектуальная карта проекта</w:t>
+      </w:r>
+    </w:p>
+    <w:p>
+      <w:pPr>
+        <w:pStyle w:val="1c"/>
+        <w:keepNext/>
+        <w:numPr>
+          <w:ilvl w:val="0"/>
+          <w:numId w:val="100"/>
+        </w:numPr>
+        <w:shd w:val="clear" w:color="auto" w:fill="FFFFFF"/>
+        <w:spacing w:before="100" w:beforeAutospacing="1" w:after="0" w:line="360" w:lineRule="auto"/>
+        <w:jc w:val="both"/>
+        <w:rPr>
+          <w:rFonts w:ascii="Times New Roman" w:hAnsi="Times New Roman"/>
+          <w:color w:val="000000"/>
+          <w:sz w:val="28"/>
+          <w:szCs w:val="28"/>
+          <w:shd w:val="clear" w:color="auto" w:fill="FFFFFF"/>
+        </w:rPr>
+      </w:pPr>
+      <w:r>
+        <w:rPr>
+          <w:rFonts w:ascii="Times New Roman" w:hAnsi="Times New Roman"/>
+          <w:color w:val="000000"/>
+          <w:sz w:val="28"/>
+          <w:szCs w:val="28"/>
+          <w:shd w:val="clear" w:color="auto" w:fill="FFFFFF"/>
+          <w:lang w:val="ru-RU"/>
+        </w:rPr>
+        <w:t>Диаграмма Ганта</w:t>
+      </w:r>
+    </w:p>
+    <w:p>
+      <w:pPr>
+        <w:keepNext/>
         <w:spacing w:before="120" w:line="360" w:lineRule="auto"/>
         <w:jc w:val="center"/>
         <w:rPr>
+          <w:rFonts w:ascii="Times New Roman" w:eastAsia="Aptos" w:hAnsi="Times New Roman" w:cs="Times New Roman"/>
+          <w:kern w:val="2"/>
+          <w:sz w:val="28"/>
+          <w:szCs w:val="28"/>
+          <w:lang w:bidi="ar"/>
+        </w:rPr>
+      </w:pPr>
+      <w:r>
+        <w:rPr>
+          <w:rFonts w:ascii="Times New Roman" w:eastAsia="Aptos" w:hAnsi="Times New Roman" w:cs="Times New Roman"/>
+          <w:noProof/>
+          <w:kern w:val="2"/>
+          <w:sz w:val="28"/>
+          <w:szCs w:val="28"/>
+          <w:lang w:bidi="ar"/>
+        </w:rPr>
+        <w:drawing>
+          <wp:inline distT="0" distB="0" distL="0" distR="0" wp14:anchorId="68C259EA" wp14:editId="44D33EA3">
+            <wp:extent cx="5940425" cy="974090"/>
+            <wp:effectExtent l="0" t="0" r="3175" b="0"/>
+            <wp:docPr id="3" name="Рисунок 2" descr="Изображение выглядит как текст, линия, Шрифт, График&#10;&#10;Содержимое, созданное искусственным интеллектом, может быть неверным.">
+              <a:extLst xmlns:a="http://schemas.openxmlformats.org/drawingml/2006/main">
+                <a:ext uri="{FF2B5EF4-FFF2-40B4-BE49-F238E27FC236}">
+                  <a16:creationId xmlns:a16="http://schemas.microsoft.com/office/drawing/2014/main" id="{8D2CC1DD-1DCA-FAC2-A466-F267007CDDCE}"/>
+                </a:ext>
+              </a:extLst>
+            </wp:docPr>
+            <wp:cNvGraphicFramePr>
+              <a:graphicFrameLocks xmlns:a="http://schemas.openxmlformats.org/drawingml/2006/main" noChangeAspect="1"/>
+            </wp:cNvGraphicFramePr>
+            <a:graphic xmlns:a="http://schemas.openxmlformats.org/drawingml/2006/main">
+              <a:graphicData uri="http://schemas.openxmlformats.org/drawingml/2006/picture">
+                <pic:pic xmlns:pic="http://schemas.openxmlformats.org/drawingml/2006/picture">
+                  <pic:nvPicPr>
+                    <pic:cNvPr id="3" name="Рисунок 2" descr="Изображение выглядит как текст, линия, Шрифт, График&#10;&#10;Содержимое, созданное искусственным интеллектом, может быть неверным.">
+                      <a:extLst>
+                        <a:ext uri="{FF2B5EF4-FFF2-40B4-BE49-F238E27FC236}">
+                          <a16:creationId xmlns:a16="http://schemas.microsoft.com/office/drawing/2014/main" id="{8D2CC1DD-1DCA-FAC2-A466-F267007CDDCE}"/>
+                        </a:ext>
+                      </a:extLst>
+                    </pic:cNvPr>
+                    <pic:cNvPicPr>
+                      <a:picLocks noChangeAspect="1"/>
+                    </pic:cNvPicPr>
+                  </pic:nvPicPr>
+                  <pic:blipFill>
+                    <a:blip r:embed="rId13"/>
+                    <a:srcRect l="16177"/>
+                    <a:stretch>
+                      <a:fillRect/>
+                    </a:stretch>
+                  </pic:blipFill>
+                  <pic:spPr>
+                    <a:xfrm>
+                      <a:off x="0" y="0"/>
+                      <a:ext cx="5940425" cy="974090"/>
+                    </a:xfrm>
+                    <a:prstGeom prst="rect">
+                      <a:avLst/>
+                    </a:prstGeom>
+                  </pic:spPr>
+                </pic:pic>
+              </a:graphicData>
+            </a:graphic>
+          </wp:inline>
+        </w:drawing>
+      </w:r>
+    </w:p>
+    <w:p>
+      <w:pPr>
+        <w:spacing w:before="120" w:line="360" w:lineRule="auto"/>
+        <w:jc w:val="center"/>
+        <w:rPr>
           <w:rFonts w:ascii="Times New Roman" w:hAnsi="Times New Roman" w:cs="Times New Roman"/>
           <w:color w:val="000000"/>
           <w:kern w:val="2"/>
           <w:sz w:val="28"/>
           <w:szCs w:val="28"/>
           <w:shd w:val="clear" w:color="auto" w:fill="FFFFFF"/>
+          <w:lang w:val="ru-RU"/>
         </w:rPr>
       </w:pPr>
       <w:r>
@@ -14688,6 +12989,7 @@
           <w:sz w:val="28"/>
           <w:szCs w:val="28"/>
           <w:shd w:val="clear" w:color="auto" w:fill="FFFFFF"/>
+          <w:lang w:val="ru-RU"/>
         </w:rPr>
         <w:t>–</w:t>
       </w:r>
@@ -14701,33 +13003,7 @@
           <w:shd w:val="clear" w:color="auto" w:fill="FFFFFF"/>
           <w:lang w:val="ru-RU"/>
         </w:rPr>
-        <w:t xml:space="preserve"> Диаграмма </w:t>
-      </w:r>
-      <w:proofErr w:type="spellStart"/>
-      <w:r>
-        <w:rPr>
-          <w:rFonts w:ascii="Times New Roman" w:hAnsi="Times New Roman" w:cs="Times New Roman"/>
-          <w:color w:val="000000"/>
-          <w:kern w:val="2"/>
-          <w:sz w:val="28"/>
-          <w:szCs w:val="28"/>
-          <w:shd w:val="clear" w:color="auto" w:fill="FFFFFF"/>
-          <w:lang w:val="ru-RU"/>
-        </w:rPr>
-        <w:t>Ганта</w:t>
-      </w:r>
-      <w:proofErr w:type="spellEnd"/>
-      <w:r>
-        <w:rPr>
-          <w:rFonts w:ascii="Times New Roman" w:hAnsi="Times New Roman" w:cs="Times New Roman"/>
-          <w:color w:val="000000"/>
-          <w:kern w:val="2"/>
-          <w:sz w:val="28"/>
-          <w:szCs w:val="28"/>
-          <w:shd w:val="clear" w:color="auto" w:fill="FFFFFF"/>
-          <w:lang w:val="ru-RU"/>
-        </w:rPr>
-        <w:t xml:space="preserve"> для проекта</w:t>
+        <w:t xml:space="preserve"> Диаграмма Ганта для проекта</w:t>
       </w:r>
     </w:p>
     <w:p>
@@ -14929,6 +13205,67 @@
     </w:p>
     <w:p>
       <w:pPr>
+        <w:spacing w:before="120" w:line="360" w:lineRule="auto"/>
+        <w:jc w:val="center"/>
+        <w:rPr>
+          <w:rFonts w:ascii="Times New Roman" w:hAnsi="Times New Roman" w:cs="Times New Roman"/>
+          <w:color w:val="000000"/>
+          <w:kern w:val="2"/>
+          <w:sz w:val="28"/>
+          <w:szCs w:val="28"/>
+          <w:shd w:val="clear" w:color="auto" w:fill="FFFFFF"/>
+        </w:rPr>
+      </w:pPr>
+      <w:r>
+        <w:rPr>
+          <w:noProof/>
+        </w:rPr>
+        <w:lastRenderedPageBreak/>
+        <w:drawing>
+          <wp:inline distT="0" distB="0" distL="0" distR="0" wp14:anchorId="0886EB04" wp14:editId="63611D0C">
+            <wp:extent cx="5940425" cy="2541905"/>
+            <wp:effectExtent l="0" t="0" r="3175" b="0"/>
+            <wp:docPr id="1434544724" name="Рисунок 1"/>
+            <wp:cNvGraphicFramePr>
+              <a:graphicFrameLocks xmlns:a="http://schemas.openxmlformats.org/drawingml/2006/main" noChangeAspect="1"/>
+            </wp:cNvGraphicFramePr>
+            <a:graphic xmlns:a="http://schemas.openxmlformats.org/drawingml/2006/main">
+              <a:graphicData uri="http://schemas.openxmlformats.org/drawingml/2006/picture">
+                <pic:pic xmlns:pic="http://schemas.openxmlformats.org/drawingml/2006/picture">
+                  <pic:nvPicPr>
+                    <pic:cNvPr id="1434544724" name=""/>
+                    <pic:cNvPicPr/>
+                  </pic:nvPicPr>
+                  <pic:blipFill>
+                    <a:blip r:embed="rId16">
+                      <a:extLst>
+                        <a:ext uri="{96DAC541-7B7A-43D3-8B79-37D633B846F1}">
+                          <asvg:svgBlip xmlns:asvg="http://schemas.microsoft.com/office/drawing/2016/SVG/main" r:embed="rId17"/>
+                        </a:ext>
+                      </a:extLst>
+                    </a:blip>
+                    <a:stretch>
+                      <a:fillRect/>
+                    </a:stretch>
+                  </pic:blipFill>
+                  <pic:spPr>
+                    <a:xfrm>
+                      <a:off x="0" y="0"/>
+                      <a:ext cx="5940425" cy="2541905"/>
+                    </a:xfrm>
+                    <a:prstGeom prst="rect">
+                      <a:avLst/>
+                    </a:prstGeom>
+                  </pic:spPr>
+                </pic:pic>
+              </a:graphicData>
+            </a:graphic>
+          </wp:inline>
+        </w:drawing>
+      </w:r>
+    </w:p>
+    <w:p>
+      <w:pPr>
         <w:keepNext/>
         <w:numPr>
           <w:ilvl w:val="0"/>
@@ -14952,7 +13289,6 @@
           <w:shd w:val="clear" w:color="auto" w:fill="FFFFFF"/>
           <w:lang w:val="ru-RU"/>
         </w:rPr>
-        <w:lastRenderedPageBreak/>
         <w:t xml:space="preserve">Диаграмма </w:t>
       </w:r>
       <w:r>
@@ -15000,10 +13336,10 @@
                     <pic:cNvPicPr/>
                   </pic:nvPicPr>
                   <pic:blipFill>
-                    <a:blip r:embed="rId16">
+                    <a:blip r:embed="rId18">
                       <a:extLst>
                         <a:ext uri="{96DAC541-7B7A-43D3-8B79-37D633B846F1}">
-                          <asvg:svgBlip xmlns:asvg="http://schemas.microsoft.com/office/drawing/2016/SVG/main" r:embed="rId17"/>
+                          <asvg:svgBlip xmlns:asvg="http://schemas.microsoft.com/office/drawing/2016/SVG/main" r:embed="rId19"/>
                         </a:ext>
                       </a:extLst>
                     </a:blip>
@@ -15165,6 +13501,7 @@
           <w:szCs w:val="28"/>
           <w:lang w:val="ru-RU"/>
         </w:rPr>
+        <w:lastRenderedPageBreak/>
         <w:t xml:space="preserve"> </w:t>
       </w:r>
       <w:r>
@@ -15219,10 +13556,10 @@
                     <pic:cNvPicPr/>
                   </pic:nvPicPr>
                   <pic:blipFill>
-                    <a:blip r:embed="rId18">
+                    <a:blip r:embed="rId20">
                       <a:extLst>
                         <a:ext uri="{96DAC541-7B7A-43D3-8B79-37D633B846F1}">
-                          <asvg:svgBlip xmlns:asvg="http://schemas.microsoft.com/office/drawing/2016/SVG/main" r:embed="rId19"/>
+                          <asvg:svgBlip xmlns:asvg="http://schemas.microsoft.com/office/drawing/2016/SVG/main" r:embed="rId21"/>
                         </a:ext>
                       </a:extLst>
                     </a:blip>
@@ -15404,10 +13741,16 @@
           <w:szCs w:val="28"/>
         </w:rPr>
         <w:drawing>
-          <wp:inline distT="0" distB="0" distL="0" distR="0" wp14:anchorId="210A0A40" wp14:editId="20A0FC5A">
-            <wp:extent cx="5940425" cy="3114040"/>
-            <wp:effectExtent l="0" t="0" r="3175" b="0"/>
-            <wp:docPr id="443394834" name="Рисунок 1"/>
+          <wp:inline distT="0" distB="0" distL="0" distR="0" wp14:anchorId="41912515" wp14:editId="02124B24">
+            <wp:extent cx="5940425" cy="3542665"/>
+            <wp:effectExtent l="0" t="0" r="3175" b="635"/>
+            <wp:docPr id="27" name="Рисунок 26">
+              <a:extLst xmlns:a="http://schemas.openxmlformats.org/drawingml/2006/main">
+                <a:ext uri="{FF2B5EF4-FFF2-40B4-BE49-F238E27FC236}">
+                  <a16:creationId xmlns:a16="http://schemas.microsoft.com/office/drawing/2014/main" id="{F541FC25-2B2D-8FD3-F4B0-D4574EE66F6C}"/>
+                </a:ext>
+              </a:extLst>
+            </wp:docPr>
             <wp:cNvGraphicFramePr>
               <a:graphicFrameLocks xmlns:a="http://schemas.openxmlformats.org/drawingml/2006/main" noChangeAspect="1"/>
             </wp:cNvGraphicFramePr>
@@ -15415,175 +13758,16 @@
               <a:graphicData uri="http://schemas.openxmlformats.org/drawingml/2006/picture">
                 <pic:pic xmlns:pic="http://schemas.openxmlformats.org/drawingml/2006/picture">
                   <pic:nvPicPr>
-                    <pic:cNvPr id="443394834" name=""/>
-                    <pic:cNvPicPr/>
-                  </pic:nvPicPr>
-                  <pic:blipFill>
-                    <a:blip r:embed="rId20">
+                    <pic:cNvPr id="27" name="Рисунок 26">
                       <a:extLst>
-                        <a:ext uri="{96DAC541-7B7A-43D3-8B79-37D633B846F1}">
-                          <asvg:svgBlip xmlns:asvg="http://schemas.microsoft.com/office/drawing/2016/SVG/main" r:embed="rId21"/>
+                        <a:ext uri="{FF2B5EF4-FFF2-40B4-BE49-F238E27FC236}">
+                          <a16:creationId xmlns:a16="http://schemas.microsoft.com/office/drawing/2014/main" id="{F541FC25-2B2D-8FD3-F4B0-D4574EE66F6C}"/>
                         </a:ext>
                       </a:extLst>
-                    </a:blip>
-                    <a:stretch>
-                      <a:fillRect/>
-                    </a:stretch>
-                  </pic:blipFill>
-                  <pic:spPr>
-                    <a:xfrm>
-                      <a:off x="0" y="0"/>
-                      <a:ext cx="5940425" cy="3114040"/>
-                    </a:xfrm>
-                    <a:prstGeom prst="rect">
-                      <a:avLst/>
-                    </a:prstGeom>
-                  </pic:spPr>
-                </pic:pic>
-              </a:graphicData>
-            </a:graphic>
-          </wp:inline>
-        </w:drawing>
-      </w:r>
-    </w:p>
-    <w:p>
-      <w:pPr>
-        <w:spacing w:before="120" w:line="360" w:lineRule="auto"/>
-        <w:jc w:val="center"/>
-        <w:rPr>
-          <w:rFonts w:ascii="Times New Roman" w:hAnsi="Times New Roman" w:cs="Times New Roman"/>
-          <w:color w:val="000000"/>
-          <w:kern w:val="2"/>
-          <w:sz w:val="28"/>
-          <w:szCs w:val="28"/>
-          <w:shd w:val="clear" w:color="auto" w:fill="FFFFFF"/>
-          <w:lang w:val="ru-RU"/>
-        </w:rPr>
-      </w:pPr>
-      <w:r>
-        <w:rPr>
-          <w:rFonts w:ascii="Times New Roman" w:eastAsia="Aptos" w:hAnsi="Times New Roman" w:cs="Times New Roman"/>
-          <w:kern w:val="2"/>
-          <w:sz w:val="28"/>
-          <w:szCs w:val="28"/>
-          <w:lang w:val="ru-RU" w:bidi="ar"/>
-        </w:rPr>
-        <w:t xml:space="preserve">Рисунок </w:t>
-      </w:r>
-      <w:r>
-        <w:rPr>
-          <w:rFonts w:ascii="Times New Roman" w:eastAsia="Aptos" w:hAnsi="Times New Roman" w:cs="Times New Roman"/>
-          <w:kern w:val="2"/>
-          <w:sz w:val="28"/>
-          <w:szCs w:val="28"/>
-          <w:lang w:val="ru-RU" w:bidi="ar"/>
-        </w:rPr>
-        <w:t>8</w:t>
-      </w:r>
-      <w:r>
-        <w:rPr>
-          <w:rFonts w:ascii="Times New Roman" w:eastAsia="Aptos" w:hAnsi="Times New Roman" w:cs="Times New Roman"/>
-          <w:kern w:val="2"/>
-          <w:sz w:val="28"/>
-          <w:szCs w:val="28"/>
-          <w:lang w:val="ru-RU" w:bidi="ar"/>
-        </w:rPr>
-        <w:t xml:space="preserve"> </w:t>
-      </w:r>
-      <w:r>
-        <w:rPr>
-          <w:rFonts w:ascii="Times New Roman" w:hAnsi="Times New Roman" w:cs="Times New Roman"/>
-          <w:color w:val="000000"/>
-          <w:kern w:val="2"/>
-          <w:sz w:val="28"/>
-          <w:szCs w:val="28"/>
-          <w:shd w:val="clear" w:color="auto" w:fill="FFFFFF"/>
-          <w:lang w:val="ru-RU"/>
-        </w:rPr>
-        <w:t>–</w:t>
-      </w:r>
-      <w:r>
-        <w:rPr>
-          <w:rFonts w:ascii="Times New Roman" w:hAnsi="Times New Roman" w:cs="Times New Roman"/>
-          <w:color w:val="000000"/>
-          <w:kern w:val="2"/>
-          <w:sz w:val="28"/>
-          <w:szCs w:val="28"/>
-          <w:shd w:val="clear" w:color="auto" w:fill="FFFFFF"/>
-          <w:lang w:val="ru-RU"/>
-        </w:rPr>
-        <w:t xml:space="preserve"> </w:t>
-      </w:r>
-      <w:r>
-        <w:rPr>
-          <w:rFonts w:ascii="Times New Roman" w:hAnsi="Times New Roman" w:cs="Times New Roman"/>
-          <w:color w:val="000000"/>
-          <w:kern w:val="2"/>
-          <w:sz w:val="28"/>
-          <w:szCs w:val="28"/>
-          <w:shd w:val="clear" w:color="auto" w:fill="FFFFFF"/>
-          <w:lang w:val="ru-RU"/>
-        </w:rPr>
-        <w:t>Диаграмма декомпозиции бизнес-процесса постановки поручения</w:t>
-      </w:r>
-    </w:p>
-    <w:p>
-      <w:pPr>
-        <w:keepNext/>
-        <w:numPr>
-          <w:ilvl w:val="0"/>
-          <w:numId w:val="100"/>
-        </w:numPr>
-        <w:spacing w:before="480" w:line="360" w:lineRule="auto"/>
-        <w:ind w:left="357" w:hanging="357"/>
-        <w:rPr>
-          <w:rFonts w:ascii="Times New Roman" w:hAnsi="Times New Roman" w:cs="Times New Roman"/>
-          <w:sz w:val="28"/>
-          <w:szCs w:val="28"/>
-        </w:rPr>
-      </w:pPr>
-      <w:r>
-        <w:rPr>
-          <w:rFonts w:ascii="Times New Roman" w:hAnsi="Times New Roman" w:cs="Times New Roman"/>
-          <w:sz w:val="28"/>
-          <w:szCs w:val="28"/>
-          <w:lang w:val="ru-RU"/>
-        </w:rPr>
-        <w:lastRenderedPageBreak/>
-        <w:t xml:space="preserve"> Схема архитектуры приложения</w:t>
-      </w:r>
-    </w:p>
-    <w:p>
-      <w:pPr>
-        <w:keepNext/>
-        <w:spacing w:before="120" w:line="360" w:lineRule="auto"/>
-        <w:jc w:val="center"/>
-        <w:rPr>
-          <w:rFonts w:ascii="Times New Roman" w:hAnsi="Times New Roman" w:cs="Times New Roman"/>
-          <w:sz w:val="28"/>
-          <w:szCs w:val="28"/>
-        </w:rPr>
-      </w:pPr>
-      <w:r>
-        <w:rPr>
-          <w:rFonts w:ascii="Times New Roman" w:hAnsi="Times New Roman" w:cs="Times New Roman"/>
-          <w:sz w:val="28"/>
-          <w:szCs w:val="28"/>
-        </w:rPr>
-        <w:drawing>
-          <wp:inline distT="0" distB="0" distL="0" distR="0" wp14:anchorId="78EB926A" wp14:editId="005CEDFD">
-            <wp:extent cx="3438525" cy="7248525"/>
-            <wp:effectExtent l="0" t="0" r="9525" b="9525"/>
-            <wp:docPr id="419146124" name="Рисунок 1"/>
-            <wp:cNvGraphicFramePr>
-              <a:graphicFrameLocks xmlns:a="http://schemas.openxmlformats.org/drawingml/2006/main" noChangeAspect="1"/>
-            </wp:cNvGraphicFramePr>
-            <a:graphic xmlns:a="http://schemas.openxmlformats.org/drawingml/2006/main">
-              <a:graphicData uri="http://schemas.openxmlformats.org/drawingml/2006/picture">
-                <pic:pic xmlns:pic="http://schemas.openxmlformats.org/drawingml/2006/picture">
-                  <pic:nvPicPr>
-                    <pic:cNvPr id="419146124" name=""/>
-                    <pic:cNvPicPr/>
+                    </pic:cNvPr>
+                    <pic:cNvPicPr>
+                      <a:picLocks noChangeAspect="1"/>
+                    </pic:cNvPicPr>
                   </pic:nvPicPr>
                   <pic:blipFill>
                     <a:blip r:embed="rId22">
@@ -15600,7 +13784,7 @@
                   <pic:spPr>
                     <a:xfrm>
                       <a:off x="0" y="0"/>
-                      <a:ext cx="3438525" cy="7248525"/>
+                      <a:ext cx="5940425" cy="3542665"/>
                     </a:xfrm>
                     <a:prstGeom prst="rect">
                       <a:avLst/>
@@ -15645,7 +13829,7 @@
           <w:szCs w:val="28"/>
           <w:lang w:val="ru-RU" w:bidi="ar"/>
         </w:rPr>
-        <w:t>9</w:t>
+        <w:t>8</w:t>
       </w:r>
       <w:r>
         <w:rPr>
@@ -15691,7 +13875,7 @@
           <w:shd w:val="clear" w:color="auto" w:fill="FFFFFF"/>
           <w:lang w:val="ru-RU"/>
         </w:rPr>
-        <w:t>Схема архитектуры приложения</w:t>
+        <w:t>Диаграмма декомпозиции бизнес-процесса постановки поручения</w:t>
       </w:r>
     </w:p>
     <w:p>
@@ -15717,7 +13901,7 @@
           <w:lang w:val="ru-RU"/>
         </w:rPr>
         <w:lastRenderedPageBreak/>
-        <w:t xml:space="preserve"> Прототип программного продукта</w:t>
+        <w:t>Диаграмма декомпозиции</w:t>
       </w:r>
     </w:p>
     <w:p>
@@ -15734,6 +13918,722 @@
       <w:r>
         <w:rPr>
           <w:rFonts w:ascii="Times New Roman" w:hAnsi="Times New Roman" w:cs="Times New Roman"/>
+          <w:noProof/>
+          <w:sz w:val="28"/>
+          <w:szCs w:val="28"/>
+        </w:rPr>
+        <w:drawing>
+          <wp:inline distT="0" distB="0" distL="0" distR="0" wp14:anchorId="2C4BF399" wp14:editId="01C95D54">
+            <wp:extent cx="5940425" cy="3272790"/>
+            <wp:effectExtent l="0" t="0" r="3175" b="3810"/>
+            <wp:docPr id="7" name="Рисунок 6">
+              <a:extLst xmlns:a="http://schemas.openxmlformats.org/drawingml/2006/main">
+                <a:ext uri="{FF2B5EF4-FFF2-40B4-BE49-F238E27FC236}">
+                  <a16:creationId xmlns:a16="http://schemas.microsoft.com/office/drawing/2014/main" id="{B5D036D4-8EF5-6992-672F-2A5948555815}"/>
+                </a:ext>
+              </a:extLst>
+            </wp:docPr>
+            <wp:cNvGraphicFramePr>
+              <a:graphicFrameLocks xmlns:a="http://schemas.openxmlformats.org/drawingml/2006/main" noChangeAspect="1"/>
+            </wp:cNvGraphicFramePr>
+            <a:graphic xmlns:a="http://schemas.openxmlformats.org/drawingml/2006/main">
+              <a:graphicData uri="http://schemas.openxmlformats.org/drawingml/2006/picture">
+                <pic:pic xmlns:pic="http://schemas.openxmlformats.org/drawingml/2006/picture">
+                  <pic:nvPicPr>
+                    <pic:cNvPr id="7" name="Рисунок 6">
+                      <a:extLst>
+                        <a:ext uri="{FF2B5EF4-FFF2-40B4-BE49-F238E27FC236}">
+                          <a16:creationId xmlns:a16="http://schemas.microsoft.com/office/drawing/2014/main" id="{B5D036D4-8EF5-6992-672F-2A5948555815}"/>
+                        </a:ext>
+                      </a:extLst>
+                    </pic:cNvPr>
+                    <pic:cNvPicPr>
+                      <a:picLocks noChangeAspect="1"/>
+                    </pic:cNvPicPr>
+                  </pic:nvPicPr>
+                  <pic:blipFill>
+                    <a:blip r:embed="rId24">
+                      <a:extLst>
+                        <a:ext uri="{96DAC541-7B7A-43D3-8B79-37D633B846F1}">
+                          <asvg:svgBlip xmlns:asvg="http://schemas.microsoft.com/office/drawing/2016/SVG/main" r:embed="rId25"/>
+                        </a:ext>
+                      </a:extLst>
+                    </a:blip>
+                    <a:stretch>
+                      <a:fillRect/>
+                    </a:stretch>
+                  </pic:blipFill>
+                  <pic:spPr>
+                    <a:xfrm>
+                      <a:off x="0" y="0"/>
+                      <a:ext cx="5940425" cy="3272790"/>
+                    </a:xfrm>
+                    <a:prstGeom prst="rect">
+                      <a:avLst/>
+                    </a:prstGeom>
+                  </pic:spPr>
+                </pic:pic>
+              </a:graphicData>
+            </a:graphic>
+          </wp:inline>
+        </w:drawing>
+      </w:r>
+    </w:p>
+    <w:p>
+      <w:pPr>
+        <w:spacing w:before="120" w:line="360" w:lineRule="auto"/>
+        <w:jc w:val="center"/>
+        <w:rPr>
+          <w:rFonts w:ascii="Times New Roman" w:hAnsi="Times New Roman" w:cs="Times New Roman"/>
+          <w:color w:val="000000"/>
+          <w:kern w:val="2"/>
+          <w:sz w:val="28"/>
+          <w:szCs w:val="28"/>
+          <w:shd w:val="clear" w:color="auto" w:fill="FFFFFF"/>
+          <w:lang w:val="ru-RU"/>
+        </w:rPr>
+      </w:pPr>
+      <w:r>
+        <w:rPr>
+          <w:rFonts w:ascii="Times New Roman" w:eastAsia="Aptos" w:hAnsi="Times New Roman" w:cs="Times New Roman"/>
+          <w:kern w:val="2"/>
+          <w:sz w:val="28"/>
+          <w:szCs w:val="28"/>
+          <w:lang w:val="ru-RU" w:bidi="ar"/>
+        </w:rPr>
+        <w:t xml:space="preserve">Рисунок </w:t>
+      </w:r>
+      <w:r>
+        <w:rPr>
+          <w:rFonts w:ascii="Times New Roman" w:eastAsia="Aptos" w:hAnsi="Times New Roman" w:cs="Times New Roman"/>
+          <w:kern w:val="2"/>
+          <w:sz w:val="28"/>
+          <w:szCs w:val="28"/>
+          <w:lang w:val="ru-RU" w:bidi="ar"/>
+        </w:rPr>
+        <w:t>9</w:t>
+      </w:r>
+      <w:r>
+        <w:rPr>
+          <w:rFonts w:ascii="Times New Roman" w:eastAsia="Aptos" w:hAnsi="Times New Roman" w:cs="Times New Roman"/>
+          <w:kern w:val="2"/>
+          <w:sz w:val="28"/>
+          <w:szCs w:val="28"/>
+          <w:lang w:val="ru-RU" w:bidi="ar"/>
+        </w:rPr>
+        <w:t xml:space="preserve"> </w:t>
+      </w:r>
+      <w:r>
+        <w:rPr>
+          <w:rFonts w:ascii="Times New Roman" w:hAnsi="Times New Roman" w:cs="Times New Roman"/>
+          <w:color w:val="000000"/>
+          <w:kern w:val="2"/>
+          <w:sz w:val="28"/>
+          <w:szCs w:val="28"/>
+          <w:shd w:val="clear" w:color="auto" w:fill="FFFFFF"/>
+          <w:lang w:val="ru-RU"/>
+        </w:rPr>
+        <w:t>–</w:t>
+      </w:r>
+      <w:r>
+        <w:rPr>
+          <w:rFonts w:ascii="Times New Roman" w:hAnsi="Times New Roman" w:cs="Times New Roman"/>
+          <w:color w:val="000000"/>
+          <w:kern w:val="2"/>
+          <w:sz w:val="28"/>
+          <w:szCs w:val="28"/>
+          <w:shd w:val="clear" w:color="auto" w:fill="FFFFFF"/>
+          <w:lang w:val="ru-RU"/>
+        </w:rPr>
+        <w:t xml:space="preserve"> </w:t>
+      </w:r>
+      <w:r>
+        <w:rPr>
+          <w:rFonts w:ascii="Times New Roman" w:hAnsi="Times New Roman" w:cs="Times New Roman"/>
+          <w:color w:val="000000"/>
+          <w:kern w:val="2"/>
+          <w:sz w:val="28"/>
+          <w:szCs w:val="28"/>
+          <w:shd w:val="clear" w:color="auto" w:fill="FFFFFF"/>
+          <w:lang w:val="ru-RU"/>
+        </w:rPr>
+        <w:t>Диаграмма декомпозиции процесса проверки полномочий</w:t>
+      </w:r>
+    </w:p>
+    <w:p>
+      <w:pPr>
+        <w:spacing w:before="120" w:line="360" w:lineRule="auto"/>
+        <w:jc w:val="center"/>
+        <w:rPr>
+          <w:rFonts w:ascii="Times New Roman" w:hAnsi="Times New Roman" w:cs="Times New Roman"/>
+          <w:color w:val="000000"/>
+          <w:kern w:val="2"/>
+          <w:sz w:val="28"/>
+          <w:szCs w:val="28"/>
+          <w:shd w:val="clear" w:color="auto" w:fill="FFFFFF"/>
+        </w:rPr>
+      </w:pPr>
+      <w:r>
+        <w:rPr>
+          <w:rFonts w:ascii="Times New Roman" w:hAnsi="Times New Roman" w:cs="Times New Roman"/>
+          <w:noProof/>
+          <w:color w:val="000000"/>
+          <w:kern w:val="2"/>
+          <w:sz w:val="28"/>
+          <w:szCs w:val="28"/>
+          <w:shd w:val="clear" w:color="auto" w:fill="FFFFFF"/>
+        </w:rPr>
+        <w:drawing>
+          <wp:inline distT="0" distB="0" distL="0" distR="0" wp14:anchorId="24CC5750" wp14:editId="4E3E6384">
+            <wp:extent cx="4400550" cy="2686050"/>
+            <wp:effectExtent l="0" t="0" r="0" b="0"/>
+            <wp:docPr id="1630705645" name="Рисунок 1"/>
+            <wp:cNvGraphicFramePr>
+              <a:graphicFrameLocks xmlns:a="http://schemas.openxmlformats.org/drawingml/2006/main" noChangeAspect="1"/>
+            </wp:cNvGraphicFramePr>
+            <a:graphic xmlns:a="http://schemas.openxmlformats.org/drawingml/2006/main">
+              <a:graphicData uri="http://schemas.openxmlformats.org/drawingml/2006/picture">
+                <pic:pic xmlns:pic="http://schemas.openxmlformats.org/drawingml/2006/picture">
+                  <pic:nvPicPr>
+                    <pic:cNvPr id="1630705645" name=""/>
+                    <pic:cNvPicPr/>
+                  </pic:nvPicPr>
+                  <pic:blipFill>
+                    <a:blip r:embed="rId26">
+                      <a:extLst>
+                        <a:ext uri="{96DAC541-7B7A-43D3-8B79-37D633B846F1}">
+                          <asvg:svgBlip xmlns:asvg="http://schemas.microsoft.com/office/drawing/2016/SVG/main" r:embed="rId27"/>
+                        </a:ext>
+                      </a:extLst>
+                    </a:blip>
+                    <a:stretch>
+                      <a:fillRect/>
+                    </a:stretch>
+                  </pic:blipFill>
+                  <pic:spPr>
+                    <a:xfrm>
+                      <a:off x="0" y="0"/>
+                      <a:ext cx="4400550" cy="2686050"/>
+                    </a:xfrm>
+                    <a:prstGeom prst="rect">
+                      <a:avLst/>
+                    </a:prstGeom>
+                  </pic:spPr>
+                </pic:pic>
+              </a:graphicData>
+            </a:graphic>
+          </wp:inline>
+        </w:drawing>
+      </w:r>
+    </w:p>
+    <w:p>
+      <w:pPr>
+        <w:spacing w:before="120" w:line="360" w:lineRule="auto"/>
+        <w:jc w:val="center"/>
+        <w:rPr>
+          <w:rFonts w:ascii="Times New Roman" w:hAnsi="Times New Roman" w:cs="Times New Roman"/>
+          <w:color w:val="000000"/>
+          <w:kern w:val="2"/>
+          <w:sz w:val="28"/>
+          <w:szCs w:val="28"/>
+          <w:shd w:val="clear" w:color="auto" w:fill="FFFFFF"/>
+        </w:rPr>
+      </w:pPr>
+      <w:r>
+        <w:rPr>
+          <w:rFonts w:ascii="Times New Roman" w:hAnsi="Times New Roman" w:cs="Times New Roman"/>
+          <w:noProof/>
+          <w:color w:val="000000"/>
+          <w:kern w:val="2"/>
+          <w:sz w:val="28"/>
+          <w:szCs w:val="28"/>
+          <w:shd w:val="clear" w:color="auto" w:fill="FFFFFF"/>
+        </w:rPr>
+        <w:lastRenderedPageBreak/>
+        <w:drawing>
+          <wp:inline distT="0" distB="0" distL="0" distR="0" wp14:anchorId="0AF369AA" wp14:editId="3729511C">
+            <wp:extent cx="5708649" cy="3085099"/>
+            <wp:effectExtent l="0" t="0" r="6985" b="1270"/>
+            <wp:docPr id="5" name="Рисунок 4">
+              <a:extLst xmlns:a="http://schemas.openxmlformats.org/drawingml/2006/main">
+                <a:ext uri="{FF2B5EF4-FFF2-40B4-BE49-F238E27FC236}">
+                  <a16:creationId xmlns:a16="http://schemas.microsoft.com/office/drawing/2014/main" id="{011821C0-9D81-F872-F514-CD2BE7F2A9BE}"/>
+                </a:ext>
+              </a:extLst>
+            </wp:docPr>
+            <wp:cNvGraphicFramePr>
+              <a:graphicFrameLocks xmlns:a="http://schemas.openxmlformats.org/drawingml/2006/main" noChangeAspect="1"/>
+            </wp:cNvGraphicFramePr>
+            <a:graphic xmlns:a="http://schemas.openxmlformats.org/drawingml/2006/main">
+              <a:graphicData uri="http://schemas.openxmlformats.org/drawingml/2006/picture">
+                <pic:pic xmlns:pic="http://schemas.openxmlformats.org/drawingml/2006/picture">
+                  <pic:nvPicPr>
+                    <pic:cNvPr id="5" name="Рисунок 4">
+                      <a:extLst>
+                        <a:ext uri="{FF2B5EF4-FFF2-40B4-BE49-F238E27FC236}">
+                          <a16:creationId xmlns:a16="http://schemas.microsoft.com/office/drawing/2014/main" id="{011821C0-9D81-F872-F514-CD2BE7F2A9BE}"/>
+                        </a:ext>
+                      </a:extLst>
+                    </pic:cNvPr>
+                    <pic:cNvPicPr>
+                      <a:picLocks noChangeAspect="1"/>
+                    </pic:cNvPicPr>
+                  </pic:nvPicPr>
+                  <pic:blipFill>
+                    <a:blip r:embed="rId28">
+                      <a:extLst>
+                        <a:ext uri="{96DAC541-7B7A-43D3-8B79-37D633B846F1}">
+                          <asvg:svgBlip xmlns:asvg="http://schemas.microsoft.com/office/drawing/2016/SVG/main" r:embed="rId29"/>
+                        </a:ext>
+                      </a:extLst>
+                    </a:blip>
+                    <a:stretch>
+                      <a:fillRect/>
+                    </a:stretch>
+                  </pic:blipFill>
+                  <pic:spPr>
+                    <a:xfrm>
+                      <a:off x="0" y="0"/>
+                      <a:ext cx="5708649" cy="3085099"/>
+                    </a:xfrm>
+                    <a:prstGeom prst="rect">
+                      <a:avLst/>
+                    </a:prstGeom>
+                  </pic:spPr>
+                </pic:pic>
+              </a:graphicData>
+            </a:graphic>
+          </wp:inline>
+        </w:drawing>
+      </w:r>
+    </w:p>
+    <w:p>
+      <w:pPr>
+        <w:spacing w:before="120" w:line="360" w:lineRule="auto"/>
+        <w:jc w:val="center"/>
+        <w:rPr>
+          <w:rFonts w:ascii="Times New Roman" w:hAnsi="Times New Roman" w:cs="Times New Roman"/>
+          <w:color w:val="000000"/>
+          <w:kern w:val="2"/>
+          <w:sz w:val="28"/>
+          <w:szCs w:val="28"/>
+          <w:shd w:val="clear" w:color="auto" w:fill="FFFFFF"/>
+        </w:rPr>
+      </w:pPr>
+      <w:r>
+        <w:rPr>
+          <w:rFonts w:ascii="Times New Roman" w:hAnsi="Times New Roman" w:cs="Times New Roman"/>
+          <w:noProof/>
+          <w:color w:val="000000"/>
+          <w:kern w:val="2"/>
+          <w:sz w:val="28"/>
+          <w:szCs w:val="28"/>
+          <w:shd w:val="clear" w:color="auto" w:fill="FFFFFF"/>
+          <w:lang w:val="ru-RU"/>
+        </w:rPr>
+        <w:lastRenderedPageBreak/>
+        <w:drawing>
+          <wp:inline distT="0" distB="0" distL="0" distR="0" wp14:anchorId="39022F60" wp14:editId="2327B65E">
+            <wp:extent cx="5940425" cy="5948045"/>
+            <wp:effectExtent l="0" t="0" r="3175" b="0"/>
+            <wp:docPr id="1713430668" name="Рисунок 1"/>
+            <wp:cNvGraphicFramePr>
+              <a:graphicFrameLocks xmlns:a="http://schemas.openxmlformats.org/drawingml/2006/main" noChangeAspect="1"/>
+            </wp:cNvGraphicFramePr>
+            <a:graphic xmlns:a="http://schemas.openxmlformats.org/drawingml/2006/main">
+              <a:graphicData uri="http://schemas.openxmlformats.org/drawingml/2006/picture">
+                <pic:pic xmlns:pic="http://schemas.openxmlformats.org/drawingml/2006/picture">
+                  <pic:nvPicPr>
+                    <pic:cNvPr id="1713430668" name=""/>
+                    <pic:cNvPicPr/>
+                  </pic:nvPicPr>
+                  <pic:blipFill>
+                    <a:blip r:embed="rId30">
+                      <a:extLst>
+                        <a:ext uri="{96DAC541-7B7A-43D3-8B79-37D633B846F1}">
+                          <asvg:svgBlip xmlns:asvg="http://schemas.microsoft.com/office/drawing/2016/SVG/main" r:embed="rId31"/>
+                        </a:ext>
+                      </a:extLst>
+                    </a:blip>
+                    <a:stretch>
+                      <a:fillRect/>
+                    </a:stretch>
+                  </pic:blipFill>
+                  <pic:spPr>
+                    <a:xfrm>
+                      <a:off x="0" y="0"/>
+                      <a:ext cx="5940425" cy="5948045"/>
+                    </a:xfrm>
+                    <a:prstGeom prst="rect">
+                      <a:avLst/>
+                    </a:prstGeom>
+                  </pic:spPr>
+                </pic:pic>
+              </a:graphicData>
+            </a:graphic>
+          </wp:inline>
+        </w:drawing>
+      </w:r>
+    </w:p>
+    <w:p>
+      <w:pPr>
+        <w:spacing w:before="120" w:line="360" w:lineRule="auto"/>
+        <w:jc w:val="center"/>
+        <w:rPr>
+          <w:rFonts w:ascii="Times New Roman" w:hAnsi="Times New Roman" w:cs="Times New Roman"/>
+          <w:color w:val="000000"/>
+          <w:kern w:val="2"/>
+          <w:sz w:val="28"/>
+          <w:szCs w:val="28"/>
+          <w:shd w:val="clear" w:color="auto" w:fill="FFFFFF"/>
+        </w:rPr>
+      </w:pPr>
+      <w:r>
+        <w:rPr>
+          <w:rFonts w:ascii="Times New Roman" w:hAnsi="Times New Roman" w:cs="Times New Roman"/>
+          <w:color w:val="000000"/>
+          <w:kern w:val="2"/>
+          <w:sz w:val="28"/>
+          <w:szCs w:val="28"/>
+          <w:shd w:val="clear" w:color="auto" w:fill="FFFFFF"/>
+        </w:rPr>
+        <w:lastRenderedPageBreak/>
+        <w:drawing>
+          <wp:inline distT="0" distB="0" distL="0" distR="0" wp14:anchorId="7A7BDC47" wp14:editId="4D90959E">
+            <wp:extent cx="5940425" cy="4735830"/>
+            <wp:effectExtent l="0" t="0" r="3175" b="7620"/>
+            <wp:docPr id="220286325" name="Рисунок 1"/>
+            <wp:cNvGraphicFramePr>
+              <a:graphicFrameLocks xmlns:a="http://schemas.openxmlformats.org/drawingml/2006/main" noChangeAspect="1"/>
+            </wp:cNvGraphicFramePr>
+            <a:graphic xmlns:a="http://schemas.openxmlformats.org/drawingml/2006/main">
+              <a:graphicData uri="http://schemas.openxmlformats.org/drawingml/2006/picture">
+                <pic:pic xmlns:pic="http://schemas.openxmlformats.org/drawingml/2006/picture">
+                  <pic:nvPicPr>
+                    <pic:cNvPr id="220286325" name=""/>
+                    <pic:cNvPicPr/>
+                  </pic:nvPicPr>
+                  <pic:blipFill>
+                    <a:blip r:embed="rId32">
+                      <a:extLst>
+                        <a:ext uri="{96DAC541-7B7A-43D3-8B79-37D633B846F1}">
+                          <asvg:svgBlip xmlns:asvg="http://schemas.microsoft.com/office/drawing/2016/SVG/main" r:embed="rId33"/>
+                        </a:ext>
+                      </a:extLst>
+                    </a:blip>
+                    <a:stretch>
+                      <a:fillRect/>
+                    </a:stretch>
+                  </pic:blipFill>
+                  <pic:spPr>
+                    <a:xfrm>
+                      <a:off x="0" y="0"/>
+                      <a:ext cx="5940425" cy="4735830"/>
+                    </a:xfrm>
+                    <a:prstGeom prst="rect">
+                      <a:avLst/>
+                    </a:prstGeom>
+                  </pic:spPr>
+                </pic:pic>
+              </a:graphicData>
+            </a:graphic>
+          </wp:inline>
+        </w:drawing>
+      </w:r>
+    </w:p>
+    <w:p>
+      <w:pPr>
+        <w:spacing w:before="120" w:line="360" w:lineRule="auto"/>
+        <w:jc w:val="center"/>
+        <w:rPr>
+          <w:rFonts w:ascii="Times New Roman" w:hAnsi="Times New Roman" w:cs="Times New Roman"/>
+          <w:color w:val="000000"/>
+          <w:kern w:val="2"/>
+          <w:sz w:val="28"/>
+          <w:szCs w:val="28"/>
+          <w:shd w:val="clear" w:color="auto" w:fill="FFFFFF"/>
+        </w:rPr>
+      </w:pPr>
+      <w:r>
+        <w:rPr>
+          <w:rFonts w:ascii="Times New Roman" w:hAnsi="Times New Roman" w:cs="Times New Roman"/>
+          <w:color w:val="000000"/>
+          <w:kern w:val="2"/>
+          <w:sz w:val="28"/>
+          <w:szCs w:val="28"/>
+          <w:shd w:val="clear" w:color="auto" w:fill="FFFFFF"/>
+        </w:rPr>
+        <w:lastRenderedPageBreak/>
+        <w:drawing>
+          <wp:inline distT="0" distB="0" distL="0" distR="0" wp14:anchorId="28CAD14C" wp14:editId="07CC2B47">
+            <wp:extent cx="3118352" cy="5670549"/>
+            <wp:effectExtent l="0" t="0" r="6350" b="6985"/>
+            <wp:docPr id="2082607623" name="Рисунок 4">
+              <a:extLst xmlns:a="http://schemas.openxmlformats.org/drawingml/2006/main">
+                <a:ext uri="{FF2B5EF4-FFF2-40B4-BE49-F238E27FC236}">
+                  <a16:creationId xmlns:a16="http://schemas.microsoft.com/office/drawing/2014/main" id="{8CFF89CA-BD26-C529-E344-E5C747A35462}"/>
+                </a:ext>
+              </a:extLst>
+            </wp:docPr>
+            <wp:cNvGraphicFramePr>
+              <a:graphicFrameLocks xmlns:a="http://schemas.openxmlformats.org/drawingml/2006/main" noChangeAspect="1"/>
+            </wp:cNvGraphicFramePr>
+            <a:graphic xmlns:a="http://schemas.openxmlformats.org/drawingml/2006/main">
+              <a:graphicData uri="http://schemas.openxmlformats.org/drawingml/2006/picture">
+                <pic:pic xmlns:pic="http://schemas.openxmlformats.org/drawingml/2006/picture">
+                  <pic:nvPicPr>
+                    <pic:cNvPr id="5" name="Рисунок 4">
+                      <a:extLst>
+                        <a:ext uri="{FF2B5EF4-FFF2-40B4-BE49-F238E27FC236}">
+                          <a16:creationId xmlns:a16="http://schemas.microsoft.com/office/drawing/2014/main" id="{8CFF89CA-BD26-C529-E344-E5C747A35462}"/>
+                        </a:ext>
+                      </a:extLst>
+                    </pic:cNvPr>
+                    <pic:cNvPicPr>
+                      <a:picLocks noChangeAspect="1"/>
+                    </pic:cNvPicPr>
+                  </pic:nvPicPr>
+                  <pic:blipFill>
+                    <a:blip r:embed="rId34">
+                      <a:extLst>
+                        <a:ext uri="{96DAC541-7B7A-43D3-8B79-37D633B846F1}">
+                          <asvg:svgBlip xmlns:asvg="http://schemas.microsoft.com/office/drawing/2016/SVG/main" r:embed="rId35"/>
+                        </a:ext>
+                      </a:extLst>
+                    </a:blip>
+                    <a:stretch>
+                      <a:fillRect/>
+                    </a:stretch>
+                  </pic:blipFill>
+                  <pic:spPr>
+                    <a:xfrm>
+                      <a:off x="0" y="0"/>
+                      <a:ext cx="3118352" cy="5670549"/>
+                    </a:xfrm>
+                    <a:prstGeom prst="rect">
+                      <a:avLst/>
+                    </a:prstGeom>
+                  </pic:spPr>
+                </pic:pic>
+              </a:graphicData>
+            </a:graphic>
+          </wp:inline>
+        </w:drawing>
+      </w:r>
+    </w:p>
+    <w:p>
+      <w:pPr>
+        <w:keepNext/>
+        <w:numPr>
+          <w:ilvl w:val="0"/>
+          <w:numId w:val="100"/>
+        </w:numPr>
+        <w:spacing w:before="480" w:line="360" w:lineRule="auto"/>
+        <w:ind w:left="357" w:hanging="357"/>
+        <w:rPr>
+          <w:rFonts w:ascii="Times New Roman" w:hAnsi="Times New Roman" w:cs="Times New Roman"/>
+          <w:sz w:val="28"/>
+          <w:szCs w:val="28"/>
+        </w:rPr>
+      </w:pPr>
+      <w:r>
+        <w:rPr>
+          <w:rFonts w:ascii="Times New Roman" w:hAnsi="Times New Roman" w:cs="Times New Roman"/>
+          <w:sz w:val="28"/>
+          <w:szCs w:val="28"/>
+          <w:lang w:val="ru-RU"/>
+        </w:rPr>
+        <w:lastRenderedPageBreak/>
+        <w:t xml:space="preserve"> Схема архитектуры приложения</w:t>
+      </w:r>
+    </w:p>
+    <w:p>
+      <w:pPr>
+        <w:keepNext/>
+        <w:spacing w:before="120" w:line="360" w:lineRule="auto"/>
+        <w:jc w:val="center"/>
+        <w:rPr>
+          <w:rFonts w:ascii="Times New Roman" w:hAnsi="Times New Roman" w:cs="Times New Roman"/>
+          <w:sz w:val="28"/>
+          <w:szCs w:val="28"/>
+        </w:rPr>
+      </w:pPr>
+      <w:r>
+        <w:rPr>
+          <w:rFonts w:ascii="Times New Roman" w:hAnsi="Times New Roman" w:cs="Times New Roman"/>
+          <w:noProof/>
+          <w:sz w:val="28"/>
+          <w:szCs w:val="28"/>
+        </w:rPr>
+        <w:drawing>
+          <wp:inline distT="0" distB="0" distL="0" distR="0" wp14:anchorId="294B2C4E" wp14:editId="13339982">
+            <wp:extent cx="1475105" cy="4249420"/>
+            <wp:effectExtent l="0" t="0" r="0" b="0"/>
+            <wp:docPr id="1526020642" name="Рисунок 2"/>
+            <wp:cNvGraphicFramePr>
+              <a:graphicFrameLocks xmlns:a="http://schemas.openxmlformats.org/drawingml/2006/main" noChangeAspect="1"/>
+            </wp:cNvGraphicFramePr>
+            <a:graphic xmlns:a="http://schemas.openxmlformats.org/drawingml/2006/main">
+              <a:graphicData uri="http://schemas.openxmlformats.org/drawingml/2006/picture">
+                <pic:pic xmlns:pic="http://schemas.openxmlformats.org/drawingml/2006/picture">
+                  <pic:nvPicPr>
+                    <pic:cNvPr id="0" name="Picture 2"/>
+                    <pic:cNvPicPr>
+                      <a:picLocks noChangeAspect="1" noChangeArrowheads="1"/>
+                    </pic:cNvPicPr>
+                  </pic:nvPicPr>
+                  <pic:blipFill>
+                    <a:blip r:embed="rId36">
+                      <a:extLst>
+                        <a:ext uri="{28A0092B-C50C-407E-A947-70E740481C1C}">
+                          <a14:useLocalDpi xmlns:a14="http://schemas.microsoft.com/office/drawing/2010/main" val="0"/>
+                        </a:ext>
+                      </a:extLst>
+                    </a:blip>
+                    <a:srcRect/>
+                    <a:stretch>
+                      <a:fillRect/>
+                    </a:stretch>
+                  </pic:blipFill>
+                  <pic:spPr bwMode="auto">
+                    <a:xfrm>
+                      <a:off x="0" y="0"/>
+                      <a:ext cx="1475105" cy="4249420"/>
+                    </a:xfrm>
+                    <a:prstGeom prst="rect">
+                      <a:avLst/>
+                    </a:prstGeom>
+                    <a:noFill/>
+                  </pic:spPr>
+                </pic:pic>
+              </a:graphicData>
+            </a:graphic>
+          </wp:inline>
+        </w:drawing>
+      </w:r>
+    </w:p>
+    <w:p>
+      <w:pPr>
+        <w:spacing w:before="120" w:line="360" w:lineRule="auto"/>
+        <w:jc w:val="center"/>
+        <w:rPr>
+          <w:rFonts w:ascii="Times New Roman" w:hAnsi="Times New Roman" w:cs="Times New Roman"/>
+          <w:color w:val="000000"/>
+          <w:kern w:val="2"/>
+          <w:sz w:val="28"/>
+          <w:szCs w:val="28"/>
+          <w:shd w:val="clear" w:color="auto" w:fill="FFFFFF"/>
+          <w:lang w:val="ru-RU"/>
+        </w:rPr>
+      </w:pPr>
+      <w:r>
+        <w:rPr>
+          <w:rFonts w:ascii="Times New Roman" w:eastAsia="Aptos" w:hAnsi="Times New Roman" w:cs="Times New Roman"/>
+          <w:kern w:val="2"/>
+          <w:sz w:val="28"/>
+          <w:szCs w:val="28"/>
+          <w:lang w:val="ru-RU" w:bidi="ar"/>
+        </w:rPr>
+        <w:t>Рисунок</w:t>
+      </w:r>
+      <w:r>
+        <w:rPr>
+          <w:rFonts w:ascii="Times New Roman" w:eastAsia="Aptos" w:hAnsi="Times New Roman" w:cs="Times New Roman"/>
+          <w:kern w:val="2"/>
+          <w:sz w:val="28"/>
+          <w:szCs w:val="28"/>
+          <w:lang w:val="ru-RU" w:bidi="ar"/>
+        </w:rPr>
+        <w:t xml:space="preserve"> 10</w:t>
+      </w:r>
+      <w:r>
+        <w:rPr>
+          <w:rFonts w:ascii="Times New Roman" w:eastAsia="Aptos" w:hAnsi="Times New Roman" w:cs="Times New Roman"/>
+          <w:kern w:val="2"/>
+          <w:sz w:val="28"/>
+          <w:szCs w:val="28"/>
+          <w:lang w:val="ru-RU" w:bidi="ar"/>
+        </w:rPr>
+        <w:t xml:space="preserve"> </w:t>
+      </w:r>
+      <w:r>
+        <w:rPr>
+          <w:rFonts w:ascii="Times New Roman" w:hAnsi="Times New Roman" w:cs="Times New Roman"/>
+          <w:color w:val="000000"/>
+          <w:kern w:val="2"/>
+          <w:sz w:val="28"/>
+          <w:szCs w:val="28"/>
+          <w:shd w:val="clear" w:color="auto" w:fill="FFFFFF"/>
+          <w:lang w:val="ru-RU"/>
+        </w:rPr>
+        <w:t>–</w:t>
+      </w:r>
+      <w:r>
+        <w:rPr>
+          <w:rFonts w:ascii="Times New Roman" w:hAnsi="Times New Roman" w:cs="Times New Roman"/>
+          <w:color w:val="000000"/>
+          <w:kern w:val="2"/>
+          <w:sz w:val="28"/>
+          <w:szCs w:val="28"/>
+          <w:shd w:val="clear" w:color="auto" w:fill="FFFFFF"/>
+          <w:lang w:val="ru-RU"/>
+        </w:rPr>
+        <w:t xml:space="preserve"> </w:t>
+      </w:r>
+      <w:r>
+        <w:rPr>
+          <w:rFonts w:ascii="Times New Roman" w:hAnsi="Times New Roman" w:cs="Times New Roman"/>
+          <w:color w:val="000000"/>
+          <w:kern w:val="2"/>
+          <w:sz w:val="28"/>
+          <w:szCs w:val="28"/>
+          <w:shd w:val="clear" w:color="auto" w:fill="FFFFFF"/>
+          <w:lang w:val="ru-RU"/>
+        </w:rPr>
+        <w:t>Схема архитектуры приложения</w:t>
+      </w:r>
+    </w:p>
+    <w:p>
+      <w:pPr>
+        <w:keepNext/>
+        <w:numPr>
+          <w:ilvl w:val="0"/>
+          <w:numId w:val="100"/>
+        </w:numPr>
+        <w:spacing w:before="480" w:line="360" w:lineRule="auto"/>
+        <w:ind w:left="357" w:hanging="357"/>
+        <w:rPr>
+          <w:rFonts w:ascii="Times New Roman" w:hAnsi="Times New Roman" w:cs="Times New Roman"/>
+          <w:sz w:val="28"/>
+          <w:szCs w:val="28"/>
+        </w:rPr>
+      </w:pPr>
+      <w:r>
+        <w:rPr>
+          <w:rFonts w:ascii="Times New Roman" w:hAnsi="Times New Roman" w:cs="Times New Roman"/>
+          <w:sz w:val="28"/>
+          <w:szCs w:val="28"/>
+          <w:lang w:val="ru-RU"/>
+        </w:rPr>
+        <w:lastRenderedPageBreak/>
+        <w:t xml:space="preserve"> Прототип программного продукта</w:t>
+      </w:r>
+    </w:p>
+    <w:p>
+      <w:pPr>
+        <w:keepNext/>
+        <w:spacing w:before="120" w:line="360" w:lineRule="auto"/>
+        <w:jc w:val="center"/>
+        <w:rPr>
+          <w:rFonts w:ascii="Times New Roman" w:hAnsi="Times New Roman" w:cs="Times New Roman"/>
+          <w:sz w:val="28"/>
+          <w:szCs w:val="28"/>
+        </w:rPr>
+      </w:pPr>
+      <w:r>
+        <w:rPr>
+          <w:rFonts w:ascii="Times New Roman" w:hAnsi="Times New Roman" w:cs="Times New Roman"/>
+          <w:noProof/>
           <w:sz w:val="28"/>
           <w:szCs w:val="28"/>
         </w:rPr>
@@ -15753,7 +14653,7 @@
                     <pic:cNvPicPr/>
                   </pic:nvPicPr>
                   <pic:blipFill>
-                    <a:blip r:embed="rId24"/>
+                    <a:blip r:embed="rId37"/>
                     <a:stretch>
                       <a:fillRect/>
                     </a:stretch>
@@ -15806,7 +14706,7 @@
           <w:szCs w:val="28"/>
           <w:lang w:val="ru-RU" w:bidi="ar"/>
         </w:rPr>
-        <w:t>10</w:t>
+        <w:t>1</w:t>
       </w:r>
       <w:r>
         <w:rPr>
@@ -15814,6 +14714,16 @@
           <w:kern w:val="2"/>
           <w:sz w:val="28"/>
           <w:szCs w:val="28"/>
+          <w:lang w:bidi="ar"/>
+        </w:rPr>
+        <w:t>1</w:t>
+      </w:r>
+      <w:r>
+        <w:rPr>
+          <w:rFonts w:ascii="Times New Roman" w:eastAsia="Aptos" w:hAnsi="Times New Roman" w:cs="Times New Roman"/>
+          <w:kern w:val="2"/>
+          <w:sz w:val="28"/>
+          <w:szCs w:val="28"/>
           <w:lang w:val="ru-RU" w:bidi="ar"/>
         </w:rPr>
         <w:t xml:space="preserve"> </w:t>
@@ -15867,7 +14777,7 @@
       </w:pPr>
     </w:p>
     <w:sectPr>
-      <w:headerReference w:type="default" r:id="rId25"/>
+      <w:headerReference w:type="default" r:id="rId38"/>
       <w:pgSz w:w="11906" w:h="16838"/>
       <w:pgMar w:top="1417" w:right="850" w:bottom="1417" w:left="1701" w:header="720" w:footer="720" w:gutter="0"/>
       <w:cols w:space="0"/>
@@ -15929,7 +14839,6 @@
         <w:lang w:val="ru-RU"/>
       </w:rPr>
     </w:pPr>
-    <w:proofErr w:type="spellStart"/>
     <w:r>
       <w:rPr>
         <w:rFonts w:ascii="Times New Roman Regular" w:hAnsi="Times New Roman Regular" w:cs="Times New Roman Regular"/>
@@ -15937,17 +14846,7 @@
         <w:szCs w:val="28"/>
         <w:lang w:val="ru-RU"/>
       </w:rPr>
-      <w:t>Поташов</w:t>
-    </w:r>
-    <w:proofErr w:type="spellEnd"/>
-    <w:r>
-      <w:rPr>
-        <w:rFonts w:ascii="Times New Roman Regular" w:hAnsi="Times New Roman Regular" w:cs="Times New Roman Regular"/>
-        <w:sz w:val="28"/>
-        <w:szCs w:val="28"/>
-        <w:lang w:val="ru-RU"/>
-      </w:rPr>
-      <w:t xml:space="preserve"> Павел, 3093</w:t>
+      <w:t>Поташов Павел, 3093</w:t>
     </w:r>
   </w:p>
 </w:hdr>

</xml_diff>